<commit_message>
docker - image&container updated
</commit_message>
<xml_diff>
--- a/Docker/2-image&container.docx
+++ b/Docker/2-image&container.docx
@@ -1,6 +1,6 @@
 
 <file path=word/document.xml><?xml version="1.0" encoding="utf-8"?>
-<w:document xmlns:wpc="http://schemas.microsoft.com/office/word/2010/wordprocessingCanvas" xmlns:cx="http://schemas.microsoft.com/office/drawing/2014/chartex" xmlns:cx1="http://schemas.microsoft.com/office/drawing/2015/9/8/chartex" xmlns:cx2="http://schemas.microsoft.com/office/drawing/2015/10/21/chartex" xmlns:cx3="http://schemas.microsoft.com/office/drawing/2016/5/9/chartex" xmlns:cx4="http://schemas.microsoft.com/office/drawing/2016/5/10/chartex" xmlns:cx5="http://schemas.microsoft.com/office/drawing/2016/5/11/chartex" xmlns:cx6="http://schemas.microsoft.com/office/drawing/2016/5/12/chartex" xmlns:cx7="http://schemas.microsoft.com/office/drawing/2016/5/13/chartex" xmlns:cx8="http://schemas.microsoft.com/office/drawing/2016/5/14/chartex" xmlns:mc="http://schemas.openxmlformats.org/markup-compatibility/2006" xmlns:aink="http://schemas.microsoft.com/office/drawing/2016/ink" xmlns:am3d="http://schemas.microsoft.com/office/drawing/2017/model3d" xmlns:o="urn:schemas-microsoft-com:office:office" xmlns:oel="http://schemas.microsoft.com/office/2019/extlst" xmlns:r="http://schemas.openxmlformats.org/officeDocument/2006/relationships" xmlns:m="http://schemas.openxmlformats.org/officeDocument/2006/math" xmlns:v="urn:schemas-microsoft-com:vml" xmlns:wp14="http://schemas.microsoft.com/office/word/2010/wordprocessingDrawing" xmlns:wp="http://schemas.openxmlformats.org/drawingml/2006/wordprocessingDrawing" xmlns:w10="urn:schemas-microsoft-com:office:word" xmlns:w="http://schemas.openxmlformats.org/wordprocessingml/2006/main" xmlns:w14="http://schemas.microsoft.com/office/word/2010/wordml" xmlns:w15="http://schemas.microsoft.com/office/word/2012/wordml" xmlns:w16cex="http://schemas.microsoft.com/office/word/2018/wordml/cex" xmlns:w16cid="http://schemas.microsoft.com/office/word/2016/wordml/cid" xmlns:w16="http://schemas.microsoft.com/office/word/2018/wordml" xmlns:w16du="http://schemas.microsoft.com/office/word/2023/wordml/word16du" xmlns:w16sdtdh="http://schemas.microsoft.com/office/word/2020/wordml/sdtdatahash" xmlns:w16sdtfl="http://schemas.microsoft.com/office/word/2024/wordml/sdtformatlock" xmlns:w16se="http://schemas.microsoft.com/office/word/2015/wordml/symex" xmlns:wpg="http://schemas.microsoft.com/office/word/2010/wordprocessingGroup" xmlns:wpi="http://schemas.microsoft.com/office/word/2010/wordprocessingInk" xmlns:wne="http://schemas.microsoft.com/office/word/2006/wordml" xmlns:wps="http://schemas.microsoft.com/office/word/2010/wordprocessingShape" mc:Ignorable="w14 w15 w16se w16cid w16 w16cex w16sdtdh w16sdtfl w16du wp14">
+<w:document xmlns:wpc="http://schemas.microsoft.com/office/word/2010/wordprocessingCanvas" xmlns:cx="http://schemas.microsoft.com/office/drawing/2014/chartex" xmlns:cx1="http://schemas.microsoft.com/office/drawing/2015/9/8/chartex" xmlns:cx2="http://schemas.microsoft.com/office/drawing/2015/10/21/chartex" xmlns:cx3="http://schemas.microsoft.com/office/drawing/2016/5/9/chartex" xmlns:cx4="http://schemas.microsoft.com/office/drawing/2016/5/10/chartex" xmlns:cx5="http://schemas.microsoft.com/office/drawing/2016/5/11/chartex" xmlns:cx6="http://schemas.microsoft.com/office/drawing/2016/5/12/chartex" xmlns:cx7="http://schemas.microsoft.com/office/drawing/2016/5/13/chartex" xmlns:cx8="http://schemas.microsoft.com/office/drawing/2016/5/14/chartex" xmlns:mc="http://schemas.openxmlformats.org/markup-compatibility/2006" xmlns:aink="http://schemas.microsoft.com/office/drawing/2016/ink" xmlns:am3d="http://schemas.microsoft.com/office/drawing/2017/model3d" xmlns:o="urn:schemas-microsoft-com:office:office" xmlns:oel="http://schemas.microsoft.com/office/2019/extlst" xmlns:r="http://schemas.openxmlformats.org/officeDocument/2006/relationships" xmlns:m="http://schemas.openxmlformats.org/officeDocument/2006/math" xmlns:v="urn:schemas-microsoft-com:vml" xmlns:wp14="http://schemas.microsoft.com/office/word/2010/wordprocessingDrawing" xmlns:wp="http://schemas.openxmlformats.org/drawingml/2006/wordprocessingDrawing" xmlns:w10="urn:schemas-microsoft-com:office:word" xmlns:w="http://schemas.openxmlformats.org/wordprocessingml/2006/main" xmlns:w14="http://schemas.microsoft.com/office/word/2010/wordml" xmlns:w15="http://schemas.microsoft.com/office/word/2012/wordml" xmlns:w16cex="http://schemas.microsoft.com/office/word/2018/wordml/cex" xmlns:w16cid="http://schemas.microsoft.com/office/word/2016/wordml/cid" xmlns:w16="http://schemas.microsoft.com/office/word/2018/wordml" xmlns:w16sdtdh="http://schemas.microsoft.com/office/word/2020/wordml/sdtdatahash" xmlns:w16se="http://schemas.microsoft.com/office/word/2015/wordml/symex" xmlns:wpg="http://schemas.microsoft.com/office/word/2010/wordprocessingGroup" xmlns:wpi="http://schemas.microsoft.com/office/word/2010/wordprocessingInk" xmlns:wne="http://schemas.microsoft.com/office/word/2006/wordml" xmlns:wps="http://schemas.microsoft.com/office/word/2010/wordprocessingShape" mc:Ignorable="w14 w15 w16se w16cid w16 w16cex w16sdtdh wp14">
   <w:body>
     <w:p>
       <w:pPr>
@@ -1248,7 +1248,6 @@
         <w:t xml:space="preserve"> </w:t>
       </w:r>
       <w:proofErr w:type="spellStart"/>
-      <w:proofErr w:type="gramStart"/>
       <w:r>
         <w:rPr>
           <w:rFonts w:asciiTheme="majorBidi" w:hAnsiTheme="majorBidi" w:cstheme="majorBidi"/>
@@ -1262,7 +1261,6 @@
         <w:t>nginx:latest</w:t>
       </w:r>
       <w:proofErr w:type="spellEnd"/>
-      <w:proofErr w:type="gramEnd"/>
       <w:r>
         <w:rPr>
           <w:rFonts w:asciiTheme="majorBidi" w:hAnsiTheme="majorBidi" w:cstheme="majorBidi"/>
@@ -13686,15 +13684,7 @@
           <w:sz w:val="28"/>
           <w:szCs w:val="28"/>
         </w:rPr>
-        <w:t xml:space="preserve"> </w:t>
-      </w:r>
-      <w:r>
-        <w:rPr>
-          <w:rFonts w:asciiTheme="majorBidi" w:hAnsiTheme="majorBidi" w:cstheme="majorBidi"/>
-          <w:sz w:val="28"/>
-          <w:szCs w:val="28"/>
-        </w:rPr>
-        <w:t>The container process is just a Linux process. The kernel does not care about Docker.</w:t>
+        <w:t xml:space="preserve"> The container process is just a Linux process. The kernel does not care about Docker.</w:t>
       </w:r>
     </w:p>
     <w:p>
@@ -13740,15 +13730,7 @@
           <w:sz w:val="28"/>
           <w:szCs w:val="28"/>
         </w:rPr>
-        <w:t xml:space="preserve"> </w:t>
-      </w:r>
-      <w:r>
-        <w:rPr>
-          <w:rFonts w:asciiTheme="majorBidi" w:hAnsiTheme="majorBidi" w:cstheme="majorBidi"/>
-          <w:sz w:val="28"/>
-          <w:szCs w:val="28"/>
-        </w:rPr>
-        <w:t>Shim keeps container alive and supervises it.</w:t>
+        <w:t xml:space="preserve"> Shim keeps container alive and supervises it.</w:t>
       </w:r>
     </w:p>
     <w:p>
@@ -13794,15 +13776,7 @@
           <w:sz w:val="28"/>
           <w:szCs w:val="28"/>
         </w:rPr>
-        <w:t xml:space="preserve"> </w:t>
-      </w:r>
-      <w:r>
-        <w:rPr>
-          <w:rFonts w:asciiTheme="majorBidi" w:hAnsiTheme="majorBidi" w:cstheme="majorBidi"/>
-          <w:sz w:val="28"/>
-          <w:szCs w:val="28"/>
-        </w:rPr>
-        <w:t>Provides management API and high-level orchestration.</w:t>
+        <w:t xml:space="preserve"> Provides management API and high-level orchestration.</w:t>
       </w:r>
     </w:p>
     <w:p>
@@ -13862,23 +13836,7 @@
           <w:sz w:val="28"/>
           <w:szCs w:val="28"/>
         </w:rPr>
-        <w:t>Without live restore:</w:t>
-      </w:r>
-      <w:r>
-        <w:rPr>
-          <w:rFonts w:asciiTheme="majorBidi" w:hAnsiTheme="majorBidi" w:cstheme="majorBidi"/>
-          <w:sz w:val="28"/>
-          <w:szCs w:val="28"/>
-        </w:rPr>
-        <w:t xml:space="preserve"> </w:t>
-      </w:r>
-      <w:r>
-        <w:rPr>
-          <w:rFonts w:asciiTheme="majorBidi" w:hAnsiTheme="majorBidi" w:cstheme="majorBidi"/>
-          <w:sz w:val="28"/>
-          <w:szCs w:val="28"/>
-        </w:rPr>
-        <w:t>A controlled daemon restart may stop containers.</w:t>
+        <w:t>Without live restore: A controlled daemon restart may stop containers.</w:t>
       </w:r>
     </w:p>
     <w:p>
@@ -13902,23 +13860,7 @@
           <w:sz w:val="28"/>
           <w:szCs w:val="28"/>
         </w:rPr>
-        <w:t>With live restore:</w:t>
-      </w:r>
-      <w:r>
-        <w:rPr>
-          <w:rFonts w:asciiTheme="majorBidi" w:hAnsiTheme="majorBidi" w:cstheme="majorBidi"/>
-          <w:sz w:val="28"/>
-          <w:szCs w:val="28"/>
-        </w:rPr>
-        <w:t xml:space="preserve"> </w:t>
-      </w:r>
-      <w:r>
-        <w:rPr>
-          <w:rFonts w:asciiTheme="majorBidi" w:hAnsiTheme="majorBidi" w:cstheme="majorBidi"/>
-          <w:sz w:val="28"/>
-          <w:szCs w:val="28"/>
-        </w:rPr>
-        <w:t>Containers keep running during daemon restart.</w:t>
+        <w:t>With live restore: Containers keep running during daemon restart.</w:t>
       </w:r>
     </w:p>
     <w:p>
@@ -14142,17 +14084,7 @@
           <w:sz w:val="32"/>
           <w:szCs w:val="32"/>
         </w:rPr>
-        <w:t>If</w:t>
-      </w:r>
-      <w:r>
-        <w:rPr>
-          <w:rFonts w:asciiTheme="majorBidi" w:hAnsiTheme="majorBidi" w:cstheme="majorBidi"/>
-          <w:b/>
-          <w:bCs/>
-          <w:sz w:val="32"/>
-          <w:szCs w:val="32"/>
-        </w:rPr>
-        <w:t xml:space="preserve"> </w:t>
+        <w:t xml:space="preserve">If </w:t>
       </w:r>
       <w:proofErr w:type="spellStart"/>
       <w:r>
@@ -15779,6 +15711,228 @@
           <w:szCs w:val="28"/>
         </w:rPr>
         <w:t>That’s why daemons still exist.</w:t>
+      </w:r>
+    </w:p>
+    <w:p>
+      <w:pPr>
+        <w:pStyle w:val="ListParagraph"/>
+        <w:numPr>
+          <w:ilvl w:val="0"/>
+          <w:numId w:val="59"/>
+        </w:numPr>
+        <w:ind w:left="360"/>
+        <w:jc w:val="both"/>
+        <w:rPr>
+          <w:rFonts w:asciiTheme="majorBidi" w:hAnsiTheme="majorBidi" w:cstheme="majorBidi"/>
+          <w:sz w:val="28"/>
+          <w:szCs w:val="28"/>
+        </w:rPr>
+      </w:pPr>
+      <w:r>
+        <w:rPr>
+          <w:rFonts w:asciiTheme="majorBidi" w:hAnsiTheme="majorBidi" w:cstheme="majorBidi"/>
+          <w:sz w:val="28"/>
+          <w:szCs w:val="28"/>
+        </w:rPr>
+        <w:t xml:space="preserve">If you look at modern Docker architecture and see that </w:t>
+      </w:r>
+      <w:proofErr w:type="spellStart"/>
+      <w:r>
+        <w:rPr>
+          <w:rFonts w:asciiTheme="majorBidi" w:hAnsiTheme="majorBidi" w:cstheme="majorBidi"/>
+          <w:sz w:val="28"/>
+          <w:szCs w:val="28"/>
+        </w:rPr>
+        <w:t>dockerd</w:t>
+      </w:r>
+      <w:proofErr w:type="spellEnd"/>
+      <w:r>
+        <w:rPr>
+          <w:rFonts w:asciiTheme="majorBidi" w:hAnsiTheme="majorBidi" w:cstheme="majorBidi"/>
+          <w:sz w:val="28"/>
+          <w:szCs w:val="28"/>
+        </w:rPr>
+        <w:t xml:space="preserve"> delegates container execution to </w:t>
+      </w:r>
+      <w:proofErr w:type="spellStart"/>
+      <w:r>
+        <w:rPr>
+          <w:rFonts w:asciiTheme="majorBidi" w:hAnsiTheme="majorBidi" w:cstheme="majorBidi"/>
+          <w:sz w:val="28"/>
+          <w:szCs w:val="28"/>
+        </w:rPr>
+        <w:t>containerd</w:t>
+      </w:r>
+      <w:proofErr w:type="spellEnd"/>
+      <w:r>
+        <w:rPr>
+          <w:rFonts w:asciiTheme="majorBidi" w:hAnsiTheme="majorBidi" w:cstheme="majorBidi"/>
+          <w:sz w:val="28"/>
+          <w:szCs w:val="28"/>
+        </w:rPr>
+        <w:t xml:space="preserve">, </w:t>
+      </w:r>
+      <w:proofErr w:type="spellStart"/>
+      <w:r>
+        <w:rPr>
+          <w:rFonts w:asciiTheme="majorBidi" w:hAnsiTheme="majorBidi" w:cstheme="majorBidi"/>
+          <w:sz w:val="28"/>
+          <w:szCs w:val="28"/>
+        </w:rPr>
+        <w:t>containerd</w:t>
+      </w:r>
+      <w:proofErr w:type="spellEnd"/>
+      <w:r>
+        <w:rPr>
+          <w:rFonts w:asciiTheme="majorBidi" w:hAnsiTheme="majorBidi" w:cstheme="majorBidi"/>
+          <w:sz w:val="28"/>
+          <w:szCs w:val="28"/>
+        </w:rPr>
+        <w:t xml:space="preserve">-shim, and </w:t>
+      </w:r>
+      <w:proofErr w:type="spellStart"/>
+      <w:r>
+        <w:rPr>
+          <w:rFonts w:asciiTheme="majorBidi" w:hAnsiTheme="majorBidi" w:cstheme="majorBidi"/>
+          <w:sz w:val="28"/>
+          <w:szCs w:val="28"/>
+        </w:rPr>
+        <w:t>runc</w:t>
+      </w:r>
+      <w:proofErr w:type="spellEnd"/>
+      <w:r>
+        <w:rPr>
+          <w:rFonts w:asciiTheme="majorBidi" w:hAnsiTheme="majorBidi" w:cstheme="majorBidi"/>
+          <w:sz w:val="28"/>
+          <w:szCs w:val="28"/>
+        </w:rPr>
+        <w:t xml:space="preserve">, it is reasonable to ask what the Docker daemon actually does. The answer is that </w:t>
+      </w:r>
+      <w:proofErr w:type="spellStart"/>
+      <w:r>
+        <w:rPr>
+          <w:rFonts w:asciiTheme="majorBidi" w:hAnsiTheme="majorBidi" w:cstheme="majorBidi"/>
+          <w:sz w:val="28"/>
+          <w:szCs w:val="28"/>
+        </w:rPr>
+        <w:t>dockerd</w:t>
+      </w:r>
+      <w:proofErr w:type="spellEnd"/>
+      <w:r>
+        <w:rPr>
+          <w:rFonts w:asciiTheme="majorBidi" w:hAnsiTheme="majorBidi" w:cstheme="majorBidi"/>
+          <w:sz w:val="28"/>
+          <w:szCs w:val="28"/>
+        </w:rPr>
+        <w:t xml:space="preserve"> is not a low-level container creator anymore; it is the high-level control plane of the Docker platform. It exposes and manages the Docker REST API over Unix socket or TCP, handles authentication and authorization (including TLS, registry credentials, and access to the Docker socket), manages images (pull, push, tag, prune), coordinates image building through </w:t>
+      </w:r>
+      <w:proofErr w:type="spellStart"/>
+      <w:r>
+        <w:rPr>
+          <w:rFonts w:asciiTheme="majorBidi" w:hAnsiTheme="majorBidi" w:cstheme="majorBidi"/>
+          <w:sz w:val="28"/>
+          <w:szCs w:val="28"/>
+        </w:rPr>
+        <w:t>BuildKit</w:t>
+      </w:r>
+      <w:proofErr w:type="spellEnd"/>
+      <w:r>
+        <w:rPr>
+          <w:rFonts w:asciiTheme="majorBidi" w:hAnsiTheme="majorBidi" w:cstheme="majorBidi"/>
+          <w:sz w:val="28"/>
+          <w:szCs w:val="28"/>
+        </w:rPr>
+        <w:t xml:space="preserve">, maintains metadata about containers, networks, and volumes, enforces restart policies, configures logging drivers, manages plugins, and implements Docker’s networking stack (bridge networks, overlay networks, IPAM, port publishing, service discovery). It also provides orchestration features such as Docker Swarm mode, secret and config distribution, and cluster state management. In short, </w:t>
+      </w:r>
+      <w:proofErr w:type="spellStart"/>
+      <w:r>
+        <w:rPr>
+          <w:rFonts w:asciiTheme="majorBidi" w:hAnsiTheme="majorBidi" w:cstheme="majorBidi"/>
+          <w:sz w:val="28"/>
+          <w:szCs w:val="28"/>
+        </w:rPr>
+        <w:t>runc</w:t>
+      </w:r>
+      <w:proofErr w:type="spellEnd"/>
+      <w:r>
+        <w:rPr>
+          <w:rFonts w:asciiTheme="majorBidi" w:hAnsiTheme="majorBidi" w:cstheme="majorBidi"/>
+          <w:sz w:val="28"/>
+          <w:szCs w:val="28"/>
+        </w:rPr>
+        <w:t xml:space="preserve"> creates containers, </w:t>
+      </w:r>
+      <w:proofErr w:type="spellStart"/>
+      <w:r>
+        <w:rPr>
+          <w:rFonts w:asciiTheme="majorBidi" w:hAnsiTheme="majorBidi" w:cstheme="majorBidi"/>
+          <w:sz w:val="28"/>
+          <w:szCs w:val="28"/>
+        </w:rPr>
+        <w:t>containerd</w:t>
+      </w:r>
+      <w:proofErr w:type="spellEnd"/>
+      <w:r>
+        <w:rPr>
+          <w:rFonts w:asciiTheme="majorBidi" w:hAnsiTheme="majorBidi" w:cstheme="majorBidi"/>
+          <w:sz w:val="28"/>
+          <w:szCs w:val="28"/>
+        </w:rPr>
+        <w:t xml:space="preserve"> manages their lifecycle, but </w:t>
+      </w:r>
+      <w:proofErr w:type="spellStart"/>
+      <w:r>
+        <w:rPr>
+          <w:rFonts w:asciiTheme="majorBidi" w:hAnsiTheme="majorBidi" w:cstheme="majorBidi"/>
+          <w:sz w:val="28"/>
+          <w:szCs w:val="28"/>
+        </w:rPr>
+        <w:t>dockerd</w:t>
+      </w:r>
+      <w:proofErr w:type="spellEnd"/>
+      <w:r>
+        <w:rPr>
+          <w:rFonts w:asciiTheme="majorBidi" w:hAnsiTheme="majorBidi" w:cstheme="majorBidi"/>
+          <w:sz w:val="28"/>
+          <w:szCs w:val="28"/>
+        </w:rPr>
+        <w:t xml:space="preserve"> turns those primitives into a usable container platform by acting as the centralized API server, policy engine, image manager, network controller, and orchestration layer. Without </w:t>
+      </w:r>
+      <w:proofErr w:type="spellStart"/>
+      <w:r>
+        <w:rPr>
+          <w:rFonts w:asciiTheme="majorBidi" w:hAnsiTheme="majorBidi" w:cstheme="majorBidi"/>
+          <w:sz w:val="28"/>
+          <w:szCs w:val="28"/>
+        </w:rPr>
+        <w:t>dockerd</w:t>
+      </w:r>
+      <w:proofErr w:type="spellEnd"/>
+      <w:r>
+        <w:rPr>
+          <w:rFonts w:asciiTheme="majorBidi" w:hAnsiTheme="majorBidi" w:cstheme="majorBidi"/>
+          <w:sz w:val="28"/>
+          <w:szCs w:val="28"/>
+        </w:rPr>
+        <w:t xml:space="preserve">, you would still have containers; with </w:t>
+      </w:r>
+      <w:proofErr w:type="spellStart"/>
+      <w:r>
+        <w:rPr>
+          <w:rFonts w:asciiTheme="majorBidi" w:hAnsiTheme="majorBidi" w:cstheme="majorBidi"/>
+          <w:sz w:val="28"/>
+          <w:szCs w:val="28"/>
+        </w:rPr>
+        <w:t>dockerd</w:t>
+      </w:r>
+      <w:proofErr w:type="spellEnd"/>
+      <w:r>
+        <w:rPr>
+          <w:rFonts w:asciiTheme="majorBidi" w:hAnsiTheme="majorBidi" w:cstheme="majorBidi"/>
+          <w:sz w:val="28"/>
+          <w:szCs w:val="28"/>
+        </w:rPr>
+        <w:t>, you have a complete container ecosystem.</w:t>
       </w:r>
     </w:p>
     <w:sectPr>
@@ -15792,7 +15946,7 @@
 </file>
 
 <file path=word/numbering.xml><?xml version="1.0" encoding="utf-8"?>
-<w:numbering xmlns:wpc="http://schemas.microsoft.com/office/word/2010/wordprocessingCanvas" xmlns:cx="http://schemas.microsoft.com/office/drawing/2014/chartex" xmlns:cx1="http://schemas.microsoft.com/office/drawing/2015/9/8/chartex" xmlns:cx2="http://schemas.microsoft.com/office/drawing/2015/10/21/chartex" xmlns:cx3="http://schemas.microsoft.com/office/drawing/2016/5/9/chartex" xmlns:cx4="http://schemas.microsoft.com/office/drawing/2016/5/10/chartex" xmlns:cx5="http://schemas.microsoft.com/office/drawing/2016/5/11/chartex" xmlns:cx6="http://schemas.microsoft.com/office/drawing/2016/5/12/chartex" xmlns:cx7="http://schemas.microsoft.com/office/drawing/2016/5/13/chartex" xmlns:cx8="http://schemas.microsoft.com/office/drawing/2016/5/14/chartex" xmlns:mc="http://schemas.openxmlformats.org/markup-compatibility/2006" xmlns:aink="http://schemas.microsoft.com/office/drawing/2016/ink" xmlns:am3d="http://schemas.microsoft.com/office/drawing/2017/model3d" xmlns:o="urn:schemas-microsoft-com:office:office" xmlns:oel="http://schemas.microsoft.com/office/2019/extlst" xmlns:r="http://schemas.openxmlformats.org/officeDocument/2006/relationships" xmlns:m="http://schemas.openxmlformats.org/officeDocument/2006/math" xmlns:v="urn:schemas-microsoft-com:vml" xmlns:wp14="http://schemas.microsoft.com/office/word/2010/wordprocessingDrawing" xmlns:wp="http://schemas.openxmlformats.org/drawingml/2006/wordprocessingDrawing" xmlns:w10="urn:schemas-microsoft-com:office:word" xmlns:w="http://schemas.openxmlformats.org/wordprocessingml/2006/main" xmlns:w14="http://schemas.microsoft.com/office/word/2010/wordml" xmlns:w15="http://schemas.microsoft.com/office/word/2012/wordml" xmlns:w16cex="http://schemas.microsoft.com/office/word/2018/wordml/cex" xmlns:w16cid="http://schemas.microsoft.com/office/word/2016/wordml/cid" xmlns:w16="http://schemas.microsoft.com/office/word/2018/wordml" xmlns:w16du="http://schemas.microsoft.com/office/word/2023/wordml/word16du" xmlns:w16sdtdh="http://schemas.microsoft.com/office/word/2020/wordml/sdtdatahash" xmlns:w16sdtfl="http://schemas.microsoft.com/office/word/2024/wordml/sdtformatlock" xmlns:w16se="http://schemas.microsoft.com/office/word/2015/wordml/symex" xmlns:wpg="http://schemas.microsoft.com/office/word/2010/wordprocessingGroup" xmlns:wpi="http://schemas.microsoft.com/office/word/2010/wordprocessingInk" xmlns:wne="http://schemas.microsoft.com/office/word/2006/wordml" xmlns:wps="http://schemas.microsoft.com/office/word/2010/wordprocessingShape" mc:Ignorable="w14 w15 w16se w16cid w16 w16cex w16sdtdh w16sdtfl w16du wp14">
+<w:numbering xmlns:wpc="http://schemas.microsoft.com/office/word/2010/wordprocessingCanvas" xmlns:cx="http://schemas.microsoft.com/office/drawing/2014/chartex" xmlns:cx1="http://schemas.microsoft.com/office/drawing/2015/9/8/chartex" xmlns:cx2="http://schemas.microsoft.com/office/drawing/2015/10/21/chartex" xmlns:cx3="http://schemas.microsoft.com/office/drawing/2016/5/9/chartex" xmlns:cx4="http://schemas.microsoft.com/office/drawing/2016/5/10/chartex" xmlns:cx5="http://schemas.microsoft.com/office/drawing/2016/5/11/chartex" xmlns:cx6="http://schemas.microsoft.com/office/drawing/2016/5/12/chartex" xmlns:cx7="http://schemas.microsoft.com/office/drawing/2016/5/13/chartex" xmlns:cx8="http://schemas.microsoft.com/office/drawing/2016/5/14/chartex" xmlns:mc="http://schemas.openxmlformats.org/markup-compatibility/2006" xmlns:aink="http://schemas.microsoft.com/office/drawing/2016/ink" xmlns:am3d="http://schemas.microsoft.com/office/drawing/2017/model3d" xmlns:o="urn:schemas-microsoft-com:office:office" xmlns:oel="http://schemas.microsoft.com/office/2019/extlst" xmlns:r="http://schemas.openxmlformats.org/officeDocument/2006/relationships" xmlns:m="http://schemas.openxmlformats.org/officeDocument/2006/math" xmlns:v="urn:schemas-microsoft-com:vml" xmlns:wp14="http://schemas.microsoft.com/office/word/2010/wordprocessingDrawing" xmlns:wp="http://schemas.openxmlformats.org/drawingml/2006/wordprocessingDrawing" xmlns:w10="urn:schemas-microsoft-com:office:word" xmlns:w="http://schemas.openxmlformats.org/wordprocessingml/2006/main" xmlns:w14="http://schemas.microsoft.com/office/word/2010/wordml" xmlns:w15="http://schemas.microsoft.com/office/word/2012/wordml" xmlns:w16cex="http://schemas.microsoft.com/office/word/2018/wordml/cex" xmlns:w16cid="http://schemas.microsoft.com/office/word/2016/wordml/cid" xmlns:w16="http://schemas.microsoft.com/office/word/2018/wordml" xmlns:w16sdtdh="http://schemas.microsoft.com/office/word/2020/wordml/sdtdatahash" xmlns:w16se="http://schemas.microsoft.com/office/word/2015/wordml/symex" xmlns:wpg="http://schemas.microsoft.com/office/word/2010/wordprocessingGroup" xmlns:wpi="http://schemas.microsoft.com/office/word/2010/wordprocessingInk" xmlns:wne="http://schemas.microsoft.com/office/word/2006/wordml" xmlns:wps="http://schemas.microsoft.com/office/word/2010/wordprocessingShape" mc:Ignorable="w14 w15 w16se w16cid w16 w16cex w16sdtdh wp14">
   <w:abstractNum w:abstractNumId="0" w15:restartNumberingAfterBreak="0">
     <w:nsid w:val="005B4A6E"/>
     <w:multiLevelType w:val="hybridMultilevel"/>
@@ -18737,6 +18891,119 @@
     </w:lvl>
   </w:abstractNum>
   <w:abstractNum w:abstractNumId="27" w15:restartNumberingAfterBreak="0">
+    <w:nsid w:val="3BB13CD6"/>
+    <w:multiLevelType w:val="hybridMultilevel"/>
+    <w:tmpl w:val="38E65BE0"/>
+    <w:lvl w:ilvl="0" w:tplc="0409000D">
+      <w:start w:val="1"/>
+      <w:numFmt w:val="bullet"/>
+      <w:lvlText w:val=""/>
+      <w:lvlJc w:val="left"/>
+      <w:pPr>
+        <w:ind w:left="720" w:hanging="360"/>
+      </w:pPr>
+      <w:rPr>
+        <w:rFonts w:ascii="Wingdings" w:hAnsi="Wingdings" w:hint="default"/>
+      </w:rPr>
+    </w:lvl>
+    <w:lvl w:ilvl="1" w:tplc="04090003" w:tentative="1">
+      <w:start w:val="1"/>
+      <w:numFmt w:val="bullet"/>
+      <w:lvlText w:val="o"/>
+      <w:lvlJc w:val="left"/>
+      <w:pPr>
+        <w:ind w:left="1440" w:hanging="360"/>
+      </w:pPr>
+      <w:rPr>
+        <w:rFonts w:ascii="Courier New" w:hAnsi="Courier New" w:cs="Courier New" w:hint="default"/>
+      </w:rPr>
+    </w:lvl>
+    <w:lvl w:ilvl="2" w:tplc="04090005" w:tentative="1">
+      <w:start w:val="1"/>
+      <w:numFmt w:val="bullet"/>
+      <w:lvlText w:val=""/>
+      <w:lvlJc w:val="left"/>
+      <w:pPr>
+        <w:ind w:left="2160" w:hanging="360"/>
+      </w:pPr>
+      <w:rPr>
+        <w:rFonts w:ascii="Wingdings" w:hAnsi="Wingdings" w:hint="default"/>
+      </w:rPr>
+    </w:lvl>
+    <w:lvl w:ilvl="3" w:tplc="04090001" w:tentative="1">
+      <w:start w:val="1"/>
+      <w:numFmt w:val="bullet"/>
+      <w:lvlText w:val=""/>
+      <w:lvlJc w:val="left"/>
+      <w:pPr>
+        <w:ind w:left="2880" w:hanging="360"/>
+      </w:pPr>
+      <w:rPr>
+        <w:rFonts w:ascii="Symbol" w:hAnsi="Symbol" w:hint="default"/>
+      </w:rPr>
+    </w:lvl>
+    <w:lvl w:ilvl="4" w:tplc="04090003" w:tentative="1">
+      <w:start w:val="1"/>
+      <w:numFmt w:val="bullet"/>
+      <w:lvlText w:val="o"/>
+      <w:lvlJc w:val="left"/>
+      <w:pPr>
+        <w:ind w:left="3600" w:hanging="360"/>
+      </w:pPr>
+      <w:rPr>
+        <w:rFonts w:ascii="Courier New" w:hAnsi="Courier New" w:cs="Courier New" w:hint="default"/>
+      </w:rPr>
+    </w:lvl>
+    <w:lvl w:ilvl="5" w:tplc="04090005" w:tentative="1">
+      <w:start w:val="1"/>
+      <w:numFmt w:val="bullet"/>
+      <w:lvlText w:val=""/>
+      <w:lvlJc w:val="left"/>
+      <w:pPr>
+        <w:ind w:left="4320" w:hanging="360"/>
+      </w:pPr>
+      <w:rPr>
+        <w:rFonts w:ascii="Wingdings" w:hAnsi="Wingdings" w:hint="default"/>
+      </w:rPr>
+    </w:lvl>
+    <w:lvl w:ilvl="6" w:tplc="04090001" w:tentative="1">
+      <w:start w:val="1"/>
+      <w:numFmt w:val="bullet"/>
+      <w:lvlText w:val=""/>
+      <w:lvlJc w:val="left"/>
+      <w:pPr>
+        <w:ind w:left="5040" w:hanging="360"/>
+      </w:pPr>
+      <w:rPr>
+        <w:rFonts w:ascii="Symbol" w:hAnsi="Symbol" w:hint="default"/>
+      </w:rPr>
+    </w:lvl>
+    <w:lvl w:ilvl="7" w:tplc="04090003" w:tentative="1">
+      <w:start w:val="1"/>
+      <w:numFmt w:val="bullet"/>
+      <w:lvlText w:val="o"/>
+      <w:lvlJc w:val="left"/>
+      <w:pPr>
+        <w:ind w:left="5760" w:hanging="360"/>
+      </w:pPr>
+      <w:rPr>
+        <w:rFonts w:ascii="Courier New" w:hAnsi="Courier New" w:cs="Courier New" w:hint="default"/>
+      </w:rPr>
+    </w:lvl>
+    <w:lvl w:ilvl="8" w:tplc="04090005" w:tentative="1">
+      <w:start w:val="1"/>
+      <w:numFmt w:val="bullet"/>
+      <w:lvlText w:val=""/>
+      <w:lvlJc w:val="left"/>
+      <w:pPr>
+        <w:ind w:left="6480" w:hanging="360"/>
+      </w:pPr>
+      <w:rPr>
+        <w:rFonts w:ascii="Wingdings" w:hAnsi="Wingdings" w:hint="default"/>
+      </w:rPr>
+    </w:lvl>
+  </w:abstractNum>
+  <w:abstractNum w:abstractNumId="28" w15:restartNumberingAfterBreak="0">
     <w:nsid w:val="3D8272C8"/>
     <w:multiLevelType w:val="hybridMultilevel"/>
     <w:tmpl w:val="69A42A26"/>
@@ -18849,7 +19116,7 @@
       </w:rPr>
     </w:lvl>
   </w:abstractNum>
-  <w:abstractNum w:abstractNumId="28" w15:restartNumberingAfterBreak="0">
+  <w:abstractNum w:abstractNumId="29" w15:restartNumberingAfterBreak="0">
     <w:nsid w:val="3E921BF7"/>
     <w:multiLevelType w:val="hybridMultilevel"/>
     <w:tmpl w:val="07D83C3E"/>
@@ -18962,7 +19229,7 @@
       </w:rPr>
     </w:lvl>
   </w:abstractNum>
-  <w:abstractNum w:abstractNumId="29" w15:restartNumberingAfterBreak="0">
+  <w:abstractNum w:abstractNumId="30" w15:restartNumberingAfterBreak="0">
     <w:nsid w:val="42767048"/>
     <w:multiLevelType w:val="hybridMultilevel"/>
     <w:tmpl w:val="1E98EFE6"/>
@@ -19048,7 +19315,7 @@
       </w:pPr>
     </w:lvl>
   </w:abstractNum>
-  <w:abstractNum w:abstractNumId="30" w15:restartNumberingAfterBreak="0">
+  <w:abstractNum w:abstractNumId="31" w15:restartNumberingAfterBreak="0">
     <w:nsid w:val="43067A6B"/>
     <w:multiLevelType w:val="hybridMultilevel"/>
     <w:tmpl w:val="6B8AF690"/>
@@ -19161,7 +19428,7 @@
       </w:rPr>
     </w:lvl>
   </w:abstractNum>
-  <w:abstractNum w:abstractNumId="31" w15:restartNumberingAfterBreak="0">
+  <w:abstractNum w:abstractNumId="32" w15:restartNumberingAfterBreak="0">
     <w:nsid w:val="438638CD"/>
     <w:multiLevelType w:val="hybridMultilevel"/>
     <w:tmpl w:val="8526AD56"/>
@@ -19274,7 +19541,7 @@
       </w:rPr>
     </w:lvl>
   </w:abstractNum>
-  <w:abstractNum w:abstractNumId="32" w15:restartNumberingAfterBreak="0">
+  <w:abstractNum w:abstractNumId="33" w15:restartNumberingAfterBreak="0">
     <w:nsid w:val="43FE2240"/>
     <w:multiLevelType w:val="hybridMultilevel"/>
     <w:tmpl w:val="379010B8"/>
@@ -19387,7 +19654,7 @@
       </w:rPr>
     </w:lvl>
   </w:abstractNum>
-  <w:abstractNum w:abstractNumId="33" w15:restartNumberingAfterBreak="0">
+  <w:abstractNum w:abstractNumId="34" w15:restartNumberingAfterBreak="0">
     <w:nsid w:val="440542AF"/>
     <w:multiLevelType w:val="hybridMultilevel"/>
     <w:tmpl w:val="3D3CB302"/>
@@ -19500,7 +19767,7 @@
       </w:rPr>
     </w:lvl>
   </w:abstractNum>
-  <w:abstractNum w:abstractNumId="34" w15:restartNumberingAfterBreak="0">
+  <w:abstractNum w:abstractNumId="35" w15:restartNumberingAfterBreak="0">
     <w:nsid w:val="465D19C4"/>
     <w:multiLevelType w:val="hybridMultilevel"/>
     <w:tmpl w:val="59DA5D9A"/>
@@ -19613,7 +19880,7 @@
       </w:rPr>
     </w:lvl>
   </w:abstractNum>
-  <w:abstractNum w:abstractNumId="35" w15:restartNumberingAfterBreak="0">
+  <w:abstractNum w:abstractNumId="36" w15:restartNumberingAfterBreak="0">
     <w:nsid w:val="49417DC1"/>
     <w:multiLevelType w:val="hybridMultilevel"/>
     <w:tmpl w:val="357411BA"/>
@@ -19726,7 +19993,7 @@
       </w:rPr>
     </w:lvl>
   </w:abstractNum>
-  <w:abstractNum w:abstractNumId="36" w15:restartNumberingAfterBreak="0">
+  <w:abstractNum w:abstractNumId="37" w15:restartNumberingAfterBreak="0">
     <w:nsid w:val="4EB719F3"/>
     <w:multiLevelType w:val="hybridMultilevel"/>
     <w:tmpl w:val="9306D736"/>
@@ -19839,7 +20106,7 @@
       </w:rPr>
     </w:lvl>
   </w:abstractNum>
-  <w:abstractNum w:abstractNumId="37" w15:restartNumberingAfterBreak="0">
+  <w:abstractNum w:abstractNumId="38" w15:restartNumberingAfterBreak="0">
     <w:nsid w:val="4F1224C7"/>
     <w:multiLevelType w:val="hybridMultilevel"/>
     <w:tmpl w:val="026C68CA"/>
@@ -19952,7 +20219,7 @@
       </w:rPr>
     </w:lvl>
   </w:abstractNum>
-  <w:abstractNum w:abstractNumId="38" w15:restartNumberingAfterBreak="0">
+  <w:abstractNum w:abstractNumId="39" w15:restartNumberingAfterBreak="0">
     <w:nsid w:val="53E65E4A"/>
     <w:multiLevelType w:val="hybridMultilevel"/>
     <w:tmpl w:val="8C7E6872"/>
@@ -20065,7 +20332,7 @@
       </w:rPr>
     </w:lvl>
   </w:abstractNum>
-  <w:abstractNum w:abstractNumId="39" w15:restartNumberingAfterBreak="0">
+  <w:abstractNum w:abstractNumId="40" w15:restartNumberingAfterBreak="0">
     <w:nsid w:val="57A64A4A"/>
     <w:multiLevelType w:val="hybridMultilevel"/>
     <w:tmpl w:val="57F61210"/>
@@ -20178,7 +20445,7 @@
       </w:rPr>
     </w:lvl>
   </w:abstractNum>
-  <w:abstractNum w:abstractNumId="40" w15:restartNumberingAfterBreak="0">
+  <w:abstractNum w:abstractNumId="41" w15:restartNumberingAfterBreak="0">
     <w:nsid w:val="5BD1365B"/>
     <w:multiLevelType w:val="hybridMultilevel"/>
     <w:tmpl w:val="E5B0176A"/>
@@ -20291,7 +20558,7 @@
       </w:rPr>
     </w:lvl>
   </w:abstractNum>
-  <w:abstractNum w:abstractNumId="41" w15:restartNumberingAfterBreak="0">
+  <w:abstractNum w:abstractNumId="42" w15:restartNumberingAfterBreak="0">
     <w:nsid w:val="5EDB35EC"/>
     <w:multiLevelType w:val="hybridMultilevel"/>
     <w:tmpl w:val="74A42BD4"/>
@@ -20404,7 +20671,7 @@
       </w:rPr>
     </w:lvl>
   </w:abstractNum>
-  <w:abstractNum w:abstractNumId="42" w15:restartNumberingAfterBreak="0">
+  <w:abstractNum w:abstractNumId="43" w15:restartNumberingAfterBreak="0">
     <w:nsid w:val="60224FA5"/>
     <w:multiLevelType w:val="hybridMultilevel"/>
     <w:tmpl w:val="7CE4CD1A"/>
@@ -20517,7 +20784,7 @@
       </w:rPr>
     </w:lvl>
   </w:abstractNum>
-  <w:abstractNum w:abstractNumId="43" w15:restartNumberingAfterBreak="0">
+  <w:abstractNum w:abstractNumId="44" w15:restartNumberingAfterBreak="0">
     <w:nsid w:val="60D33E1C"/>
     <w:multiLevelType w:val="hybridMultilevel"/>
     <w:tmpl w:val="83B05A04"/>
@@ -20630,7 +20897,7 @@
       </w:rPr>
     </w:lvl>
   </w:abstractNum>
-  <w:abstractNum w:abstractNumId="44" w15:restartNumberingAfterBreak="0">
+  <w:abstractNum w:abstractNumId="45" w15:restartNumberingAfterBreak="0">
     <w:nsid w:val="63520FCD"/>
     <w:multiLevelType w:val="hybridMultilevel"/>
     <w:tmpl w:val="BC20B65E"/>
@@ -20743,7 +21010,7 @@
       </w:rPr>
     </w:lvl>
   </w:abstractNum>
-  <w:abstractNum w:abstractNumId="45" w15:restartNumberingAfterBreak="0">
+  <w:abstractNum w:abstractNumId="46" w15:restartNumberingAfterBreak="0">
     <w:nsid w:val="67712598"/>
     <w:multiLevelType w:val="hybridMultilevel"/>
     <w:tmpl w:val="CF662074"/>
@@ -20856,7 +21123,7 @@
       </w:rPr>
     </w:lvl>
   </w:abstractNum>
-  <w:abstractNum w:abstractNumId="46" w15:restartNumberingAfterBreak="0">
+  <w:abstractNum w:abstractNumId="47" w15:restartNumberingAfterBreak="0">
     <w:nsid w:val="685F5CFD"/>
     <w:multiLevelType w:val="hybridMultilevel"/>
     <w:tmpl w:val="3C88BD80"/>
@@ -20969,7 +21236,7 @@
       </w:rPr>
     </w:lvl>
   </w:abstractNum>
-  <w:abstractNum w:abstractNumId="47" w15:restartNumberingAfterBreak="0">
+  <w:abstractNum w:abstractNumId="48" w15:restartNumberingAfterBreak="0">
     <w:nsid w:val="68E30751"/>
     <w:multiLevelType w:val="hybridMultilevel"/>
     <w:tmpl w:val="C180F3BC"/>
@@ -21082,7 +21349,7 @@
       </w:rPr>
     </w:lvl>
   </w:abstractNum>
-  <w:abstractNum w:abstractNumId="48" w15:restartNumberingAfterBreak="0">
+  <w:abstractNum w:abstractNumId="49" w15:restartNumberingAfterBreak="0">
     <w:nsid w:val="690A7EF9"/>
     <w:multiLevelType w:val="hybridMultilevel"/>
     <w:tmpl w:val="DD549D3C"/>
@@ -21195,7 +21462,7 @@
       </w:rPr>
     </w:lvl>
   </w:abstractNum>
-  <w:abstractNum w:abstractNumId="49" w15:restartNumberingAfterBreak="0">
+  <w:abstractNum w:abstractNumId="50" w15:restartNumberingAfterBreak="0">
     <w:nsid w:val="69E07337"/>
     <w:multiLevelType w:val="hybridMultilevel"/>
     <w:tmpl w:val="8BD25784"/>
@@ -21308,7 +21575,7 @@
       </w:rPr>
     </w:lvl>
   </w:abstractNum>
-  <w:abstractNum w:abstractNumId="50" w15:restartNumberingAfterBreak="0">
+  <w:abstractNum w:abstractNumId="51" w15:restartNumberingAfterBreak="0">
     <w:nsid w:val="6A921E1A"/>
     <w:multiLevelType w:val="hybridMultilevel"/>
     <w:tmpl w:val="EC482F82"/>
@@ -21421,7 +21688,7 @@
       </w:rPr>
     </w:lvl>
   </w:abstractNum>
-  <w:abstractNum w:abstractNumId="51" w15:restartNumberingAfterBreak="0">
+  <w:abstractNum w:abstractNumId="52" w15:restartNumberingAfterBreak="0">
     <w:nsid w:val="6A992E25"/>
     <w:multiLevelType w:val="hybridMultilevel"/>
     <w:tmpl w:val="7CB82F38"/>
@@ -21534,7 +21801,7 @@
       </w:rPr>
     </w:lvl>
   </w:abstractNum>
-  <w:abstractNum w:abstractNumId="52" w15:restartNumberingAfterBreak="0">
+  <w:abstractNum w:abstractNumId="53" w15:restartNumberingAfterBreak="0">
     <w:nsid w:val="6C0B2D42"/>
     <w:multiLevelType w:val="hybridMultilevel"/>
     <w:tmpl w:val="D8408682"/>
@@ -21647,7 +21914,7 @@
       </w:rPr>
     </w:lvl>
   </w:abstractNum>
-  <w:abstractNum w:abstractNumId="53" w15:restartNumberingAfterBreak="0">
+  <w:abstractNum w:abstractNumId="54" w15:restartNumberingAfterBreak="0">
     <w:nsid w:val="6EE87CD0"/>
     <w:multiLevelType w:val="hybridMultilevel"/>
     <w:tmpl w:val="1326F5B2"/>
@@ -21760,7 +22027,7 @@
       </w:rPr>
     </w:lvl>
   </w:abstractNum>
-  <w:abstractNum w:abstractNumId="54" w15:restartNumberingAfterBreak="0">
+  <w:abstractNum w:abstractNumId="55" w15:restartNumberingAfterBreak="0">
     <w:nsid w:val="747D26C2"/>
     <w:multiLevelType w:val="hybridMultilevel"/>
     <w:tmpl w:val="585EA518"/>
@@ -21873,7 +22140,7 @@
       </w:rPr>
     </w:lvl>
   </w:abstractNum>
-  <w:abstractNum w:abstractNumId="55" w15:restartNumberingAfterBreak="0">
+  <w:abstractNum w:abstractNumId="56" w15:restartNumberingAfterBreak="0">
     <w:nsid w:val="74BC1C1B"/>
     <w:multiLevelType w:val="hybridMultilevel"/>
     <w:tmpl w:val="DF3A32BC"/>
@@ -21986,7 +22253,7 @@
       </w:rPr>
     </w:lvl>
   </w:abstractNum>
-  <w:abstractNum w:abstractNumId="56" w15:restartNumberingAfterBreak="0">
+  <w:abstractNum w:abstractNumId="57" w15:restartNumberingAfterBreak="0">
     <w:nsid w:val="78E404C7"/>
     <w:multiLevelType w:val="hybridMultilevel"/>
     <w:tmpl w:val="FB0ED528"/>
@@ -22072,7 +22339,7 @@
       </w:pPr>
     </w:lvl>
   </w:abstractNum>
-  <w:abstractNum w:abstractNumId="57" w15:restartNumberingAfterBreak="0">
+  <w:abstractNum w:abstractNumId="58" w15:restartNumberingAfterBreak="0">
     <w:nsid w:val="7A880265"/>
     <w:multiLevelType w:val="hybridMultilevel"/>
     <w:tmpl w:val="00CE3C72"/>
@@ -22189,25 +22456,25 @@
     <w:abstractNumId w:val="10"/>
   </w:num>
   <w:num w:numId="2" w16cid:durableId="943072337">
-    <w:abstractNumId w:val="41"/>
+    <w:abstractNumId w:val="42"/>
   </w:num>
   <w:num w:numId="3" w16cid:durableId="667709974">
-    <w:abstractNumId w:val="56"/>
+    <w:abstractNumId w:val="57"/>
   </w:num>
   <w:num w:numId="4" w16cid:durableId="42875176">
     <w:abstractNumId w:val="2"/>
   </w:num>
   <w:num w:numId="5" w16cid:durableId="1469126308">
-    <w:abstractNumId w:val="27"/>
+    <w:abstractNumId w:val="28"/>
   </w:num>
   <w:num w:numId="6" w16cid:durableId="2092892987">
-    <w:abstractNumId w:val="33"/>
+    <w:abstractNumId w:val="34"/>
   </w:num>
   <w:num w:numId="7" w16cid:durableId="722296573">
-    <w:abstractNumId w:val="48"/>
+    <w:abstractNumId w:val="49"/>
   </w:num>
   <w:num w:numId="8" w16cid:durableId="938299569">
-    <w:abstractNumId w:val="29"/>
+    <w:abstractNumId w:val="30"/>
   </w:num>
   <w:num w:numId="9" w16cid:durableId="1003119981">
     <w:abstractNumId w:val="1"/>
@@ -22222,7 +22489,7 @@
     <w:abstractNumId w:val="24"/>
   </w:num>
   <w:num w:numId="13" w16cid:durableId="1643578613">
-    <w:abstractNumId w:val="47"/>
+    <w:abstractNumId w:val="48"/>
   </w:num>
   <w:num w:numId="14" w16cid:durableId="28188523">
     <w:abstractNumId w:val="14"/>
@@ -22231,58 +22498,58 @@
     <w:abstractNumId w:val="0"/>
   </w:num>
   <w:num w:numId="16" w16cid:durableId="632515647">
-    <w:abstractNumId w:val="53"/>
+    <w:abstractNumId w:val="54"/>
   </w:num>
   <w:num w:numId="17" w16cid:durableId="1717313687">
     <w:abstractNumId w:val="3"/>
   </w:num>
   <w:num w:numId="18" w16cid:durableId="350423995">
-    <w:abstractNumId w:val="38"/>
+    <w:abstractNumId w:val="39"/>
   </w:num>
   <w:num w:numId="19" w16cid:durableId="1476485022">
-    <w:abstractNumId w:val="55"/>
+    <w:abstractNumId w:val="56"/>
   </w:num>
   <w:num w:numId="20" w16cid:durableId="798887380">
     <w:abstractNumId w:val="21"/>
   </w:num>
   <w:num w:numId="21" w16cid:durableId="865338109">
-    <w:abstractNumId w:val="30"/>
+    <w:abstractNumId w:val="31"/>
   </w:num>
   <w:num w:numId="22" w16cid:durableId="1891963560">
-    <w:abstractNumId w:val="50"/>
+    <w:abstractNumId w:val="51"/>
   </w:num>
   <w:num w:numId="23" w16cid:durableId="337780777">
-    <w:abstractNumId w:val="49"/>
+    <w:abstractNumId w:val="50"/>
   </w:num>
   <w:num w:numId="24" w16cid:durableId="1319992471">
     <w:abstractNumId w:val="5"/>
   </w:num>
   <w:num w:numId="25" w16cid:durableId="127862042">
-    <w:abstractNumId w:val="40"/>
+    <w:abstractNumId w:val="41"/>
   </w:num>
   <w:num w:numId="26" w16cid:durableId="1227882914">
     <w:abstractNumId w:val="23"/>
   </w:num>
   <w:num w:numId="27" w16cid:durableId="780151792">
-    <w:abstractNumId w:val="31"/>
+    <w:abstractNumId w:val="32"/>
   </w:num>
   <w:num w:numId="28" w16cid:durableId="1863471563">
     <w:abstractNumId w:val="8"/>
   </w:num>
   <w:num w:numId="29" w16cid:durableId="371878930">
+    <w:abstractNumId w:val="37"/>
+  </w:num>
+  <w:num w:numId="30" w16cid:durableId="388262574">
+    <w:abstractNumId w:val="52"/>
+  </w:num>
+  <w:num w:numId="31" w16cid:durableId="1178665434">
     <w:abstractNumId w:val="36"/>
   </w:num>
-  <w:num w:numId="30" w16cid:durableId="388262574">
-    <w:abstractNumId w:val="51"/>
-  </w:num>
-  <w:num w:numId="31" w16cid:durableId="1178665434">
+  <w:num w:numId="32" w16cid:durableId="915287788">
     <w:abstractNumId w:val="35"/>
   </w:num>
-  <w:num w:numId="32" w16cid:durableId="915287788">
-    <w:abstractNumId w:val="34"/>
-  </w:num>
   <w:num w:numId="33" w16cid:durableId="1896235540">
-    <w:abstractNumId w:val="32"/>
+    <w:abstractNumId w:val="33"/>
   </w:num>
   <w:num w:numId="34" w16cid:durableId="1107042679">
     <w:abstractNumId w:val="6"/>
@@ -22291,22 +22558,22 @@
     <w:abstractNumId w:val="26"/>
   </w:num>
   <w:num w:numId="36" w16cid:durableId="948898611">
-    <w:abstractNumId w:val="37"/>
+    <w:abstractNumId w:val="38"/>
   </w:num>
   <w:num w:numId="37" w16cid:durableId="590242007">
-    <w:abstractNumId w:val="52"/>
+    <w:abstractNumId w:val="53"/>
   </w:num>
   <w:num w:numId="38" w16cid:durableId="857157669">
     <w:abstractNumId w:val="22"/>
   </w:num>
   <w:num w:numId="39" w16cid:durableId="906645066">
-    <w:abstractNumId w:val="28"/>
+    <w:abstractNumId w:val="29"/>
   </w:num>
   <w:num w:numId="40" w16cid:durableId="780346730">
     <w:abstractNumId w:val="16"/>
   </w:num>
   <w:num w:numId="41" w16cid:durableId="1991328286">
-    <w:abstractNumId w:val="43"/>
+    <w:abstractNumId w:val="44"/>
   </w:num>
   <w:num w:numId="42" w16cid:durableId="1379402897">
     <w:abstractNumId w:val="7"/>
@@ -22315,13 +22582,13 @@
     <w:abstractNumId w:val="17"/>
   </w:num>
   <w:num w:numId="44" w16cid:durableId="2044283027">
-    <w:abstractNumId w:val="57"/>
+    <w:abstractNumId w:val="58"/>
   </w:num>
   <w:num w:numId="45" w16cid:durableId="1396320795">
     <w:abstractNumId w:val="13"/>
   </w:num>
   <w:num w:numId="46" w16cid:durableId="1484538646">
-    <w:abstractNumId w:val="39"/>
+    <w:abstractNumId w:val="40"/>
   </w:num>
   <w:num w:numId="47" w16cid:durableId="1667320133">
     <w:abstractNumId w:val="25"/>
@@ -22330,7 +22597,7 @@
     <w:abstractNumId w:val="19"/>
   </w:num>
   <w:num w:numId="49" w16cid:durableId="41682562">
-    <w:abstractNumId w:val="42"/>
+    <w:abstractNumId w:val="43"/>
   </w:num>
   <w:num w:numId="50" w16cid:durableId="681009789">
     <w:abstractNumId w:val="9"/>
@@ -22339,31 +22606,34 @@
     <w:abstractNumId w:val="20"/>
   </w:num>
   <w:num w:numId="52" w16cid:durableId="267203936">
-    <w:abstractNumId w:val="45"/>
+    <w:abstractNumId w:val="46"/>
   </w:num>
   <w:num w:numId="53" w16cid:durableId="1364747124">
     <w:abstractNumId w:val="18"/>
   </w:num>
   <w:num w:numId="54" w16cid:durableId="465391243">
-    <w:abstractNumId w:val="44"/>
+    <w:abstractNumId w:val="45"/>
   </w:num>
   <w:num w:numId="55" w16cid:durableId="1051079903">
     <w:abstractNumId w:val="15"/>
   </w:num>
   <w:num w:numId="56" w16cid:durableId="1185172641">
-    <w:abstractNumId w:val="54"/>
+    <w:abstractNumId w:val="55"/>
   </w:num>
   <w:num w:numId="57" w16cid:durableId="762216263">
     <w:abstractNumId w:val="4"/>
   </w:num>
   <w:num w:numId="58" w16cid:durableId="523446550">
-    <w:abstractNumId w:val="46"/>
+    <w:abstractNumId w:val="47"/>
+  </w:num>
+  <w:num w:numId="59" w16cid:durableId="1654337723">
+    <w:abstractNumId w:val="27"/>
   </w:num>
 </w:numbering>
 </file>
 
 <file path=word/styles.xml><?xml version="1.0" encoding="utf-8"?>
-<w:styles xmlns:mc="http://schemas.openxmlformats.org/markup-compatibility/2006" xmlns:r="http://schemas.openxmlformats.org/officeDocument/2006/relationships" xmlns:w="http://schemas.openxmlformats.org/wordprocessingml/2006/main" xmlns:w14="http://schemas.microsoft.com/office/word/2010/wordml" xmlns:w15="http://schemas.microsoft.com/office/word/2012/wordml" xmlns:w16cex="http://schemas.microsoft.com/office/word/2018/wordml/cex" xmlns:w16cid="http://schemas.microsoft.com/office/word/2016/wordml/cid" xmlns:w16="http://schemas.microsoft.com/office/word/2018/wordml" xmlns:w16du="http://schemas.microsoft.com/office/word/2023/wordml/word16du" xmlns:w16sdtdh="http://schemas.microsoft.com/office/word/2020/wordml/sdtdatahash" xmlns:w16sdtfl="http://schemas.microsoft.com/office/word/2024/wordml/sdtformatlock" xmlns:w16se="http://schemas.microsoft.com/office/word/2015/wordml/symex" mc:Ignorable="w14 w15 w16se w16cid w16 w16cex w16sdtdh w16sdtfl w16du">
+<w:styles xmlns:mc="http://schemas.openxmlformats.org/markup-compatibility/2006" xmlns:r="http://schemas.openxmlformats.org/officeDocument/2006/relationships" xmlns:w="http://schemas.openxmlformats.org/wordprocessingml/2006/main" xmlns:w14="http://schemas.microsoft.com/office/word/2010/wordml" xmlns:w15="http://schemas.microsoft.com/office/word/2012/wordml" xmlns:w16cex="http://schemas.microsoft.com/office/word/2018/wordml/cex" xmlns:w16cid="http://schemas.microsoft.com/office/word/2016/wordml/cid" xmlns:w16="http://schemas.microsoft.com/office/word/2018/wordml" xmlns:w16sdtdh="http://schemas.microsoft.com/office/word/2020/wordml/sdtdatahash" xmlns:w16se="http://schemas.microsoft.com/office/word/2015/wordml/symex" mc:Ignorable="w14 w15 w16se w16cid w16 w16cex w16sdtdh">
   <w:docDefaults>
     <w:rPrDefault>
       <w:rPr>

</xml_diff>

<commit_message>
docker - container updated
</commit_message>
<xml_diff>
--- a/Docker/2-image&container.docx
+++ b/Docker/2-image&container.docx
@@ -15715,6 +15715,1435 @@
     </w:p>
     <w:p>
       <w:pPr>
+        <w:jc w:val="both"/>
+        <w:rPr>
+          <w:rFonts w:asciiTheme="majorBidi" w:hAnsiTheme="majorBidi" w:cstheme="majorBidi"/>
+          <w:b/>
+          <w:bCs/>
+          <w:sz w:val="32"/>
+          <w:szCs w:val="32"/>
+        </w:rPr>
+      </w:pPr>
+      <w:r>
+        <w:rPr>
+          <w:rFonts w:asciiTheme="majorBidi" w:hAnsiTheme="majorBidi" w:cstheme="majorBidi"/>
+          <w:b/>
+          <w:bCs/>
+          <w:sz w:val="32"/>
+          <w:szCs w:val="32"/>
+        </w:rPr>
+        <w:t xml:space="preserve">Is </w:t>
+      </w:r>
+      <w:proofErr w:type="spellStart"/>
+      <w:r>
+        <w:rPr>
+          <w:rFonts w:asciiTheme="majorBidi" w:hAnsiTheme="majorBidi" w:cstheme="majorBidi"/>
+          <w:b/>
+          <w:bCs/>
+          <w:sz w:val="32"/>
+          <w:szCs w:val="32"/>
+        </w:rPr>
+        <w:t>containerd</w:t>
+      </w:r>
+      <w:proofErr w:type="spellEnd"/>
+      <w:r>
+        <w:rPr>
+          <w:rFonts w:asciiTheme="majorBidi" w:hAnsiTheme="majorBidi" w:cstheme="majorBidi"/>
+          <w:b/>
+          <w:bCs/>
+          <w:sz w:val="32"/>
+          <w:szCs w:val="32"/>
+        </w:rPr>
+        <w:t xml:space="preserve"> </w:t>
+      </w:r>
+      <w:proofErr w:type="spellStart"/>
+      <w:r>
+        <w:rPr>
+          <w:rFonts w:asciiTheme="majorBidi" w:hAnsiTheme="majorBidi" w:cstheme="majorBidi"/>
+          <w:b/>
+          <w:bCs/>
+          <w:sz w:val="32"/>
+          <w:szCs w:val="32"/>
+        </w:rPr>
+        <w:t>Daemonless</w:t>
+      </w:r>
+      <w:proofErr w:type="spellEnd"/>
+      <w:r>
+        <w:rPr>
+          <w:rFonts w:asciiTheme="majorBidi" w:hAnsiTheme="majorBidi" w:cstheme="majorBidi"/>
+          <w:b/>
+          <w:bCs/>
+          <w:sz w:val="32"/>
+          <w:szCs w:val="32"/>
+        </w:rPr>
+        <w:t>?</w:t>
+      </w:r>
+    </w:p>
+    <w:p>
+      <w:pPr>
+        <w:jc w:val="both"/>
+        <w:rPr>
+          <w:rFonts w:asciiTheme="majorBidi" w:hAnsiTheme="majorBidi" w:cstheme="majorBidi"/>
+          <w:sz w:val="28"/>
+          <w:szCs w:val="28"/>
+        </w:rPr>
+      </w:pPr>
+      <w:proofErr w:type="spellStart"/>
+      <w:r>
+        <w:rPr>
+          <w:rFonts w:asciiTheme="majorBidi" w:hAnsiTheme="majorBidi" w:cstheme="majorBidi"/>
+          <w:sz w:val="28"/>
+          <w:szCs w:val="28"/>
+        </w:rPr>
+        <w:t>containerd</w:t>
+      </w:r>
+      <w:proofErr w:type="spellEnd"/>
+      <w:r>
+        <w:rPr>
+          <w:rFonts w:asciiTheme="majorBidi" w:hAnsiTheme="majorBidi" w:cstheme="majorBidi"/>
+          <w:sz w:val="28"/>
+          <w:szCs w:val="28"/>
+        </w:rPr>
+        <w:t xml:space="preserve"> is not </w:t>
+      </w:r>
+      <w:proofErr w:type="spellStart"/>
+      <w:r>
+        <w:rPr>
+          <w:rFonts w:asciiTheme="majorBidi" w:hAnsiTheme="majorBidi" w:cstheme="majorBidi"/>
+          <w:sz w:val="28"/>
+          <w:szCs w:val="28"/>
+        </w:rPr>
+        <w:t>daemonless</w:t>
+      </w:r>
+      <w:proofErr w:type="spellEnd"/>
+      <w:r>
+        <w:rPr>
+          <w:rFonts w:asciiTheme="majorBidi" w:hAnsiTheme="majorBidi" w:cstheme="majorBidi"/>
+          <w:sz w:val="28"/>
+          <w:szCs w:val="28"/>
+        </w:rPr>
+        <w:t xml:space="preserve">. It is itself a daemon. It runs as a long-lived background process that manages containers and communicates via </w:t>
+      </w:r>
+      <w:proofErr w:type="spellStart"/>
+      <w:r>
+        <w:rPr>
+          <w:rFonts w:asciiTheme="majorBidi" w:hAnsiTheme="majorBidi" w:cstheme="majorBidi"/>
+          <w:sz w:val="28"/>
+          <w:szCs w:val="28"/>
+        </w:rPr>
+        <w:t>gRPC</w:t>
+      </w:r>
+      <w:proofErr w:type="spellEnd"/>
+      <w:r>
+        <w:rPr>
+          <w:rFonts w:asciiTheme="majorBidi" w:hAnsiTheme="majorBidi" w:cstheme="majorBidi"/>
+          <w:sz w:val="28"/>
+          <w:szCs w:val="28"/>
+        </w:rPr>
+        <w:t xml:space="preserve">. What is </w:t>
+      </w:r>
+      <w:proofErr w:type="spellStart"/>
+      <w:r>
+        <w:rPr>
+          <w:rFonts w:asciiTheme="majorBidi" w:hAnsiTheme="majorBidi" w:cstheme="majorBidi"/>
+          <w:sz w:val="28"/>
+          <w:szCs w:val="28"/>
+        </w:rPr>
+        <w:t>daemonless</w:t>
+      </w:r>
+      <w:proofErr w:type="spellEnd"/>
+      <w:r>
+        <w:rPr>
+          <w:rFonts w:asciiTheme="majorBidi" w:hAnsiTheme="majorBidi" w:cstheme="majorBidi"/>
+          <w:sz w:val="28"/>
+          <w:szCs w:val="28"/>
+        </w:rPr>
+        <w:t xml:space="preserve"> is the container process after it starts: thanks to </w:t>
+      </w:r>
+      <w:proofErr w:type="spellStart"/>
+      <w:r>
+        <w:rPr>
+          <w:rFonts w:asciiTheme="majorBidi" w:hAnsiTheme="majorBidi" w:cstheme="majorBidi"/>
+          <w:sz w:val="28"/>
+          <w:szCs w:val="28"/>
+        </w:rPr>
+        <w:t>containerd</w:t>
+      </w:r>
+      <w:proofErr w:type="spellEnd"/>
+      <w:r>
+        <w:rPr>
+          <w:rFonts w:asciiTheme="majorBidi" w:hAnsiTheme="majorBidi" w:cstheme="majorBidi"/>
+          <w:sz w:val="28"/>
+          <w:szCs w:val="28"/>
+        </w:rPr>
+        <w:t xml:space="preserve">-shim, the container can keep running even if </w:t>
+      </w:r>
+      <w:proofErr w:type="spellStart"/>
+      <w:r>
+        <w:rPr>
+          <w:rFonts w:asciiTheme="majorBidi" w:hAnsiTheme="majorBidi" w:cstheme="majorBidi"/>
+          <w:sz w:val="28"/>
+          <w:szCs w:val="28"/>
+        </w:rPr>
+        <w:t>containerd</w:t>
+      </w:r>
+      <w:proofErr w:type="spellEnd"/>
+      <w:r>
+        <w:rPr>
+          <w:rFonts w:asciiTheme="majorBidi" w:hAnsiTheme="majorBidi" w:cstheme="majorBidi"/>
+          <w:sz w:val="28"/>
+          <w:szCs w:val="28"/>
+        </w:rPr>
+        <w:t xml:space="preserve"> restarts. So </w:t>
+      </w:r>
+      <w:proofErr w:type="spellStart"/>
+      <w:r>
+        <w:rPr>
+          <w:rFonts w:asciiTheme="majorBidi" w:hAnsiTheme="majorBidi" w:cstheme="majorBidi"/>
+          <w:sz w:val="28"/>
+          <w:szCs w:val="28"/>
+        </w:rPr>
+        <w:t>containerd</w:t>
+      </w:r>
+      <w:proofErr w:type="spellEnd"/>
+      <w:r>
+        <w:rPr>
+          <w:rFonts w:asciiTheme="majorBidi" w:hAnsiTheme="majorBidi" w:cstheme="majorBidi"/>
+          <w:sz w:val="28"/>
+          <w:szCs w:val="28"/>
+        </w:rPr>
+        <w:t xml:space="preserve"> is a daemon-based runtime, just a smaller and more focused one than Docker daemon.</w:t>
+      </w:r>
+    </w:p>
+    <w:p>
+      <w:pPr>
+        <w:jc w:val="both"/>
+        <w:rPr>
+          <w:rFonts w:asciiTheme="majorBidi" w:hAnsiTheme="majorBidi" w:cstheme="majorBidi"/>
+          <w:b/>
+          <w:bCs/>
+          <w:sz w:val="32"/>
+          <w:szCs w:val="32"/>
+        </w:rPr>
+      </w:pPr>
+      <w:r>
+        <w:rPr>
+          <w:rFonts w:asciiTheme="majorBidi" w:hAnsiTheme="majorBidi" w:cstheme="majorBidi"/>
+          <w:b/>
+          <w:bCs/>
+          <w:sz w:val="32"/>
+          <w:szCs w:val="32"/>
+        </w:rPr>
+        <w:t xml:space="preserve">When </w:t>
+      </w:r>
+      <w:r>
+        <w:rPr>
+          <w:rFonts w:asciiTheme="majorBidi" w:hAnsiTheme="majorBidi" w:cstheme="majorBidi"/>
+          <w:b/>
+          <w:bCs/>
+          <w:sz w:val="32"/>
+          <w:szCs w:val="32"/>
+        </w:rPr>
+        <w:t xml:space="preserve">you can work directly with </w:t>
+      </w:r>
+      <w:proofErr w:type="spellStart"/>
+      <w:r>
+        <w:rPr>
+          <w:rFonts w:asciiTheme="majorBidi" w:hAnsiTheme="majorBidi" w:cstheme="majorBidi"/>
+          <w:b/>
+          <w:bCs/>
+          <w:sz w:val="32"/>
+          <w:szCs w:val="32"/>
+        </w:rPr>
+        <w:t>containerd</w:t>
+      </w:r>
+      <w:proofErr w:type="spellEnd"/>
+      <w:r>
+        <w:rPr>
+          <w:rFonts w:asciiTheme="majorBidi" w:hAnsiTheme="majorBidi" w:cstheme="majorBidi"/>
+          <w:b/>
+          <w:bCs/>
+          <w:sz w:val="32"/>
+          <w:szCs w:val="32"/>
+        </w:rPr>
+        <w:t xml:space="preserve">, for example: </w:t>
+      </w:r>
+      <w:r>
+        <w:rPr>
+          <w:rFonts w:asciiTheme="majorBidi" w:hAnsiTheme="majorBidi" w:cstheme="majorBidi"/>
+          <w:b/>
+          <w:bCs/>
+          <w:sz w:val="32"/>
+          <w:szCs w:val="32"/>
+        </w:rPr>
+        <w:t xml:space="preserve">Kubernetes talks to </w:t>
+      </w:r>
+      <w:proofErr w:type="spellStart"/>
+      <w:r>
+        <w:rPr>
+          <w:rFonts w:asciiTheme="majorBidi" w:hAnsiTheme="majorBidi" w:cstheme="majorBidi"/>
+          <w:b/>
+          <w:bCs/>
+          <w:sz w:val="32"/>
+          <w:szCs w:val="32"/>
+        </w:rPr>
+        <w:t>containerd</w:t>
+      </w:r>
+      <w:proofErr w:type="spellEnd"/>
+      <w:r>
+        <w:rPr>
+          <w:rFonts w:asciiTheme="majorBidi" w:hAnsiTheme="majorBidi" w:cstheme="majorBidi"/>
+          <w:b/>
+          <w:bCs/>
+          <w:sz w:val="32"/>
+          <w:szCs w:val="32"/>
+        </w:rPr>
+        <w:t xml:space="preserve"> directly through the CRI (Container Runtime Interface). </w:t>
+      </w:r>
+      <w:proofErr w:type="gramStart"/>
+      <w:r>
+        <w:rPr>
+          <w:rFonts w:asciiTheme="majorBidi" w:hAnsiTheme="majorBidi" w:cstheme="majorBidi"/>
+          <w:b/>
+          <w:bCs/>
+          <w:sz w:val="32"/>
+          <w:szCs w:val="32"/>
+        </w:rPr>
+        <w:t>So</w:t>
+      </w:r>
+      <w:proofErr w:type="gramEnd"/>
+      <w:r>
+        <w:rPr>
+          <w:rFonts w:asciiTheme="majorBidi" w:hAnsiTheme="majorBidi" w:cstheme="majorBidi"/>
+          <w:b/>
+          <w:bCs/>
+          <w:sz w:val="32"/>
+          <w:szCs w:val="32"/>
+        </w:rPr>
+        <w:t xml:space="preserve"> </w:t>
+      </w:r>
+      <w:r>
+        <w:rPr>
+          <w:rFonts w:asciiTheme="majorBidi" w:hAnsiTheme="majorBidi" w:cstheme="majorBidi"/>
+          <w:b/>
+          <w:bCs/>
+          <w:sz w:val="32"/>
+          <w:szCs w:val="32"/>
+        </w:rPr>
+        <w:t>if c</w:t>
+      </w:r>
+      <w:proofErr w:type="spellStart"/>
+      <w:r>
+        <w:rPr>
+          <w:rFonts w:asciiTheme="majorBidi" w:hAnsiTheme="majorBidi" w:cstheme="majorBidi"/>
+          <w:b/>
+          <w:bCs/>
+          <w:sz w:val="32"/>
+          <w:szCs w:val="32"/>
+        </w:rPr>
+        <w:t>ontainerd</w:t>
+      </w:r>
+      <w:proofErr w:type="spellEnd"/>
+      <w:r>
+        <w:rPr>
+          <w:rFonts w:asciiTheme="majorBidi" w:hAnsiTheme="majorBidi" w:cstheme="majorBidi"/>
+          <w:b/>
+          <w:bCs/>
+          <w:sz w:val="32"/>
+          <w:szCs w:val="32"/>
+        </w:rPr>
+        <w:t xml:space="preserve"> is enough, why add Docker daemon on top?</w:t>
+      </w:r>
+    </w:p>
+    <w:p>
+      <w:pPr>
+        <w:spacing w:after="120"/>
+        <w:jc w:val="both"/>
+        <w:rPr>
+          <w:rFonts w:asciiTheme="majorBidi" w:hAnsiTheme="majorBidi" w:cstheme="majorBidi"/>
+          <w:sz w:val="28"/>
+          <w:szCs w:val="28"/>
+        </w:rPr>
+      </w:pPr>
+      <w:r>
+        <w:rPr>
+          <w:rFonts w:asciiTheme="majorBidi" w:hAnsiTheme="majorBidi" w:cstheme="majorBidi"/>
+          <w:sz w:val="28"/>
+          <w:szCs w:val="28"/>
+          <w:u w:val="single"/>
+        </w:rPr>
+        <w:t>The short answer</w:t>
+      </w:r>
+      <w:r>
+        <w:rPr>
+          <w:rFonts w:asciiTheme="majorBidi" w:hAnsiTheme="majorBidi" w:cstheme="majorBidi"/>
+          <w:sz w:val="28"/>
+          <w:szCs w:val="28"/>
+        </w:rPr>
+        <w:t xml:space="preserve">: </w:t>
+      </w:r>
+      <w:proofErr w:type="spellStart"/>
+      <w:r>
+        <w:rPr>
+          <w:rFonts w:asciiTheme="majorBidi" w:hAnsiTheme="majorBidi" w:cstheme="majorBidi"/>
+          <w:sz w:val="28"/>
+          <w:szCs w:val="28"/>
+        </w:rPr>
+        <w:t>containerd</w:t>
+      </w:r>
+      <w:proofErr w:type="spellEnd"/>
+      <w:r>
+        <w:rPr>
+          <w:rFonts w:asciiTheme="majorBidi" w:hAnsiTheme="majorBidi" w:cstheme="majorBidi"/>
+          <w:sz w:val="28"/>
+          <w:szCs w:val="28"/>
+        </w:rPr>
+        <w:t xml:space="preserve"> is a runtime manager. Docker is a platform.</w:t>
+      </w:r>
+    </w:p>
+    <w:p>
+      <w:pPr>
+        <w:spacing w:after="120"/>
+        <w:jc w:val="both"/>
+        <w:rPr>
+          <w:rFonts w:asciiTheme="majorBidi" w:hAnsiTheme="majorBidi" w:cstheme="majorBidi"/>
+          <w:sz w:val="28"/>
+          <w:szCs w:val="28"/>
+        </w:rPr>
+      </w:pPr>
+      <w:proofErr w:type="spellStart"/>
+      <w:r>
+        <w:rPr>
+          <w:rFonts w:asciiTheme="majorBidi" w:hAnsiTheme="majorBidi" w:cstheme="majorBidi"/>
+          <w:sz w:val="28"/>
+          <w:szCs w:val="28"/>
+        </w:rPr>
+        <w:t>containerd</w:t>
+      </w:r>
+      <w:proofErr w:type="spellEnd"/>
+      <w:r>
+        <w:rPr>
+          <w:rFonts w:asciiTheme="majorBidi" w:hAnsiTheme="majorBidi" w:cstheme="majorBidi"/>
+          <w:sz w:val="28"/>
+          <w:szCs w:val="28"/>
+        </w:rPr>
+        <w:t xml:space="preserve"> is intentionally minimal. It handles:</w:t>
+      </w:r>
+    </w:p>
+    <w:p>
+      <w:pPr>
+        <w:pStyle w:val="ListParagraph"/>
+        <w:numPr>
+          <w:ilvl w:val="0"/>
+          <w:numId w:val="60"/>
+        </w:numPr>
+        <w:ind w:left="360"/>
+        <w:jc w:val="both"/>
+        <w:rPr>
+          <w:rFonts w:asciiTheme="majorBidi" w:hAnsiTheme="majorBidi" w:cstheme="majorBidi"/>
+          <w:sz w:val="28"/>
+          <w:szCs w:val="28"/>
+        </w:rPr>
+      </w:pPr>
+      <w:r>
+        <w:rPr>
+          <w:rFonts w:asciiTheme="majorBidi" w:hAnsiTheme="majorBidi" w:cstheme="majorBidi"/>
+          <w:sz w:val="28"/>
+          <w:szCs w:val="28"/>
+        </w:rPr>
+        <w:t>Pulling images</w:t>
+      </w:r>
+    </w:p>
+    <w:p>
+      <w:pPr>
+        <w:pStyle w:val="ListParagraph"/>
+        <w:numPr>
+          <w:ilvl w:val="0"/>
+          <w:numId w:val="60"/>
+        </w:numPr>
+        <w:ind w:left="360"/>
+        <w:jc w:val="both"/>
+        <w:rPr>
+          <w:rFonts w:asciiTheme="majorBidi" w:hAnsiTheme="majorBidi" w:cstheme="majorBidi"/>
+          <w:sz w:val="28"/>
+          <w:szCs w:val="28"/>
+        </w:rPr>
+      </w:pPr>
+      <w:r>
+        <w:rPr>
+          <w:rFonts w:asciiTheme="majorBidi" w:hAnsiTheme="majorBidi" w:cstheme="majorBidi"/>
+          <w:sz w:val="28"/>
+          <w:szCs w:val="28"/>
+        </w:rPr>
+        <w:t>Managing snapshots</w:t>
+      </w:r>
+    </w:p>
+    <w:p>
+      <w:pPr>
+        <w:pStyle w:val="ListParagraph"/>
+        <w:numPr>
+          <w:ilvl w:val="0"/>
+          <w:numId w:val="60"/>
+        </w:numPr>
+        <w:ind w:left="360"/>
+        <w:jc w:val="both"/>
+        <w:rPr>
+          <w:rFonts w:asciiTheme="majorBidi" w:hAnsiTheme="majorBidi" w:cstheme="majorBidi"/>
+          <w:sz w:val="28"/>
+          <w:szCs w:val="28"/>
+        </w:rPr>
+      </w:pPr>
+      <w:r>
+        <w:rPr>
+          <w:rFonts w:asciiTheme="majorBidi" w:hAnsiTheme="majorBidi" w:cstheme="majorBidi"/>
+          <w:sz w:val="28"/>
+          <w:szCs w:val="28"/>
+        </w:rPr>
+        <w:t>Starting/stopping containers</w:t>
+      </w:r>
+    </w:p>
+    <w:p>
+      <w:pPr>
+        <w:pStyle w:val="ListParagraph"/>
+        <w:numPr>
+          <w:ilvl w:val="0"/>
+          <w:numId w:val="60"/>
+        </w:numPr>
+        <w:ind w:left="360"/>
+        <w:jc w:val="both"/>
+        <w:rPr>
+          <w:rFonts w:asciiTheme="majorBidi" w:hAnsiTheme="majorBidi" w:cstheme="majorBidi"/>
+          <w:sz w:val="28"/>
+          <w:szCs w:val="28"/>
+        </w:rPr>
+      </w:pPr>
+      <w:r>
+        <w:rPr>
+          <w:rFonts w:asciiTheme="majorBidi" w:hAnsiTheme="majorBidi" w:cstheme="majorBidi"/>
+          <w:sz w:val="28"/>
+          <w:szCs w:val="28"/>
+        </w:rPr>
+        <w:t>Managing container lifecycle</w:t>
+      </w:r>
+    </w:p>
+    <w:p>
+      <w:pPr>
+        <w:pStyle w:val="ListParagraph"/>
+        <w:numPr>
+          <w:ilvl w:val="0"/>
+          <w:numId w:val="60"/>
+        </w:numPr>
+        <w:ind w:left="360"/>
+        <w:jc w:val="both"/>
+        <w:rPr>
+          <w:rFonts w:asciiTheme="majorBidi" w:hAnsiTheme="majorBidi" w:cstheme="majorBidi"/>
+          <w:sz w:val="28"/>
+          <w:szCs w:val="28"/>
+        </w:rPr>
+      </w:pPr>
+      <w:r>
+        <w:rPr>
+          <w:rFonts w:asciiTheme="majorBidi" w:hAnsiTheme="majorBidi" w:cstheme="majorBidi"/>
+          <w:sz w:val="28"/>
+          <w:szCs w:val="28"/>
+        </w:rPr>
+        <w:t xml:space="preserve">Talking to low-level runtimes like </w:t>
+      </w:r>
+      <w:proofErr w:type="spellStart"/>
+      <w:r>
+        <w:rPr>
+          <w:rFonts w:asciiTheme="majorBidi" w:hAnsiTheme="majorBidi" w:cstheme="majorBidi"/>
+          <w:sz w:val="28"/>
+          <w:szCs w:val="28"/>
+        </w:rPr>
+        <w:t>runc</w:t>
+      </w:r>
+      <w:proofErr w:type="spellEnd"/>
+    </w:p>
+    <w:p>
+      <w:pPr>
+        <w:spacing w:after="120"/>
+        <w:jc w:val="both"/>
+        <w:rPr>
+          <w:rFonts w:asciiTheme="majorBidi" w:hAnsiTheme="majorBidi" w:cstheme="majorBidi"/>
+          <w:sz w:val="28"/>
+          <w:szCs w:val="28"/>
+        </w:rPr>
+      </w:pPr>
+      <w:r>
+        <w:rPr>
+          <w:rFonts w:asciiTheme="majorBidi" w:hAnsiTheme="majorBidi" w:cstheme="majorBidi"/>
+          <w:sz w:val="28"/>
+          <w:szCs w:val="28"/>
+        </w:rPr>
+        <w:t>It does not provide:</w:t>
+      </w:r>
+    </w:p>
+    <w:p>
+      <w:pPr>
+        <w:pStyle w:val="ListParagraph"/>
+        <w:numPr>
+          <w:ilvl w:val="0"/>
+          <w:numId w:val="61"/>
+        </w:numPr>
+        <w:ind w:left="360"/>
+        <w:jc w:val="both"/>
+        <w:rPr>
+          <w:rFonts w:asciiTheme="majorBidi" w:hAnsiTheme="majorBidi" w:cstheme="majorBidi"/>
+          <w:sz w:val="28"/>
+          <w:szCs w:val="28"/>
+        </w:rPr>
+      </w:pPr>
+      <w:r>
+        <w:rPr>
+          <w:rFonts w:asciiTheme="majorBidi" w:hAnsiTheme="majorBidi" w:cstheme="majorBidi"/>
+          <w:sz w:val="28"/>
+          <w:szCs w:val="28"/>
+        </w:rPr>
+        <w:t>A rich user-facing CLI</w:t>
+      </w:r>
+    </w:p>
+    <w:p>
+      <w:pPr>
+        <w:pStyle w:val="ListParagraph"/>
+        <w:numPr>
+          <w:ilvl w:val="0"/>
+          <w:numId w:val="61"/>
+        </w:numPr>
+        <w:ind w:left="360"/>
+        <w:jc w:val="both"/>
+        <w:rPr>
+          <w:rFonts w:asciiTheme="majorBidi" w:hAnsiTheme="majorBidi" w:cstheme="majorBidi"/>
+          <w:sz w:val="28"/>
+          <w:szCs w:val="28"/>
+        </w:rPr>
+      </w:pPr>
+      <w:proofErr w:type="spellStart"/>
+      <w:r>
+        <w:rPr>
+          <w:rFonts w:asciiTheme="majorBidi" w:hAnsiTheme="majorBidi" w:cstheme="majorBidi"/>
+          <w:sz w:val="28"/>
+          <w:szCs w:val="28"/>
+        </w:rPr>
+        <w:t>Dockerfile</w:t>
+      </w:r>
+      <w:proofErr w:type="spellEnd"/>
+      <w:r>
+        <w:rPr>
+          <w:rFonts w:asciiTheme="majorBidi" w:hAnsiTheme="majorBidi" w:cstheme="majorBidi"/>
+          <w:sz w:val="28"/>
+          <w:szCs w:val="28"/>
+        </w:rPr>
+        <w:t xml:space="preserve"> builds (</w:t>
+      </w:r>
+      <w:proofErr w:type="spellStart"/>
+      <w:r>
+        <w:rPr>
+          <w:rFonts w:asciiTheme="majorBidi" w:hAnsiTheme="majorBidi" w:cstheme="majorBidi"/>
+          <w:sz w:val="28"/>
+          <w:szCs w:val="28"/>
+        </w:rPr>
+        <w:t>BuildKit</w:t>
+      </w:r>
+      <w:proofErr w:type="spellEnd"/>
+      <w:r>
+        <w:rPr>
+          <w:rFonts w:asciiTheme="majorBidi" w:hAnsiTheme="majorBidi" w:cstheme="majorBidi"/>
+          <w:sz w:val="28"/>
+          <w:szCs w:val="28"/>
+        </w:rPr>
+        <w:t xml:space="preserve"> integration)</w:t>
+      </w:r>
+    </w:p>
+    <w:p>
+      <w:pPr>
+        <w:pStyle w:val="ListParagraph"/>
+        <w:numPr>
+          <w:ilvl w:val="0"/>
+          <w:numId w:val="61"/>
+        </w:numPr>
+        <w:ind w:left="360"/>
+        <w:jc w:val="both"/>
+        <w:rPr>
+          <w:rFonts w:asciiTheme="majorBidi" w:hAnsiTheme="majorBidi" w:cstheme="majorBidi"/>
+          <w:sz w:val="28"/>
+          <w:szCs w:val="28"/>
+        </w:rPr>
+      </w:pPr>
+      <w:r>
+        <w:rPr>
+          <w:rFonts w:asciiTheme="majorBidi" w:hAnsiTheme="majorBidi" w:cstheme="majorBidi"/>
+          <w:sz w:val="28"/>
+          <w:szCs w:val="28"/>
+        </w:rPr>
+        <w:lastRenderedPageBreak/>
+        <w:t>High-level image management workflows</w:t>
+      </w:r>
+    </w:p>
+    <w:p>
+      <w:pPr>
+        <w:pStyle w:val="ListParagraph"/>
+        <w:numPr>
+          <w:ilvl w:val="0"/>
+          <w:numId w:val="61"/>
+        </w:numPr>
+        <w:ind w:left="360"/>
+        <w:jc w:val="both"/>
+        <w:rPr>
+          <w:rFonts w:asciiTheme="majorBidi" w:hAnsiTheme="majorBidi" w:cstheme="majorBidi"/>
+          <w:sz w:val="28"/>
+          <w:szCs w:val="28"/>
+        </w:rPr>
+      </w:pPr>
+      <w:r>
+        <w:rPr>
+          <w:rFonts w:asciiTheme="majorBidi" w:hAnsiTheme="majorBidi" w:cstheme="majorBidi"/>
+          <w:sz w:val="28"/>
+          <w:szCs w:val="28"/>
+        </w:rPr>
+        <w:t>Swarm orchestration</w:t>
+      </w:r>
+    </w:p>
+    <w:p>
+      <w:pPr>
+        <w:pStyle w:val="ListParagraph"/>
+        <w:numPr>
+          <w:ilvl w:val="0"/>
+          <w:numId w:val="61"/>
+        </w:numPr>
+        <w:ind w:left="360"/>
+        <w:jc w:val="both"/>
+        <w:rPr>
+          <w:rFonts w:asciiTheme="majorBidi" w:hAnsiTheme="majorBidi" w:cstheme="majorBidi"/>
+          <w:sz w:val="28"/>
+          <w:szCs w:val="28"/>
+        </w:rPr>
+      </w:pPr>
+      <w:r>
+        <w:rPr>
+          <w:rFonts w:asciiTheme="majorBidi" w:hAnsiTheme="majorBidi" w:cstheme="majorBidi"/>
+          <w:sz w:val="28"/>
+          <w:szCs w:val="28"/>
+        </w:rPr>
+        <w:t>Plugin system</w:t>
+      </w:r>
+    </w:p>
+    <w:p>
+      <w:pPr>
+        <w:pStyle w:val="ListParagraph"/>
+        <w:numPr>
+          <w:ilvl w:val="0"/>
+          <w:numId w:val="61"/>
+        </w:numPr>
+        <w:ind w:left="360"/>
+        <w:jc w:val="both"/>
+        <w:rPr>
+          <w:rFonts w:asciiTheme="majorBidi" w:hAnsiTheme="majorBidi" w:cstheme="majorBidi"/>
+          <w:sz w:val="28"/>
+          <w:szCs w:val="28"/>
+        </w:rPr>
+      </w:pPr>
+      <w:r>
+        <w:rPr>
+          <w:rFonts w:asciiTheme="majorBidi" w:hAnsiTheme="majorBidi" w:cstheme="majorBidi"/>
+          <w:sz w:val="28"/>
+          <w:szCs w:val="28"/>
+        </w:rPr>
+        <w:t>Volume drivers</w:t>
+      </w:r>
+    </w:p>
+    <w:p>
+      <w:pPr>
+        <w:pStyle w:val="ListParagraph"/>
+        <w:numPr>
+          <w:ilvl w:val="0"/>
+          <w:numId w:val="61"/>
+        </w:numPr>
+        <w:ind w:left="360"/>
+        <w:jc w:val="both"/>
+        <w:rPr>
+          <w:rFonts w:asciiTheme="majorBidi" w:hAnsiTheme="majorBidi" w:cstheme="majorBidi"/>
+          <w:sz w:val="28"/>
+          <w:szCs w:val="28"/>
+        </w:rPr>
+      </w:pPr>
+      <w:r>
+        <w:rPr>
+          <w:rFonts w:asciiTheme="majorBidi" w:hAnsiTheme="majorBidi" w:cstheme="majorBidi"/>
+          <w:sz w:val="28"/>
+          <w:szCs w:val="28"/>
+        </w:rPr>
+        <w:t>Full networking stack abstraction</w:t>
+      </w:r>
+    </w:p>
+    <w:p>
+      <w:pPr>
+        <w:pStyle w:val="ListParagraph"/>
+        <w:numPr>
+          <w:ilvl w:val="0"/>
+          <w:numId w:val="61"/>
+        </w:numPr>
+        <w:ind w:left="360"/>
+        <w:jc w:val="both"/>
+        <w:rPr>
+          <w:rFonts w:asciiTheme="majorBidi" w:hAnsiTheme="majorBidi" w:cstheme="majorBidi"/>
+          <w:sz w:val="28"/>
+          <w:szCs w:val="28"/>
+        </w:rPr>
+      </w:pPr>
+      <w:r>
+        <w:rPr>
+          <w:rFonts w:asciiTheme="majorBidi" w:hAnsiTheme="majorBidi" w:cstheme="majorBidi"/>
+          <w:sz w:val="28"/>
+          <w:szCs w:val="28"/>
+        </w:rPr>
+        <w:t>User-friendly API ecosystem</w:t>
+      </w:r>
+    </w:p>
+    <w:p>
+      <w:pPr>
+        <w:pStyle w:val="ListParagraph"/>
+        <w:numPr>
+          <w:ilvl w:val="0"/>
+          <w:numId w:val="61"/>
+        </w:numPr>
+        <w:ind w:left="360"/>
+        <w:jc w:val="both"/>
+        <w:rPr>
+          <w:rFonts w:asciiTheme="majorBidi" w:hAnsiTheme="majorBidi" w:cstheme="majorBidi"/>
+          <w:sz w:val="28"/>
+          <w:szCs w:val="28"/>
+        </w:rPr>
+      </w:pPr>
+      <w:r>
+        <w:rPr>
+          <w:rFonts w:asciiTheme="majorBidi" w:hAnsiTheme="majorBidi" w:cstheme="majorBidi"/>
+          <w:sz w:val="28"/>
+          <w:szCs w:val="28"/>
+        </w:rPr>
+        <w:t>Docker Compose integration</w:t>
+      </w:r>
+    </w:p>
+    <w:p>
+      <w:pPr>
+        <w:jc w:val="both"/>
+        <w:rPr>
+          <w:rFonts w:asciiTheme="majorBidi" w:hAnsiTheme="majorBidi" w:cstheme="majorBidi"/>
+          <w:sz w:val="28"/>
+          <w:szCs w:val="28"/>
+        </w:rPr>
+      </w:pPr>
+      <w:r>
+        <w:rPr>
+          <w:rFonts w:asciiTheme="majorBidi" w:hAnsiTheme="majorBidi" w:cstheme="majorBidi"/>
+          <w:b/>
+          <w:bCs/>
+          <w:sz w:val="28"/>
+          <w:szCs w:val="28"/>
+        </w:rPr>
+        <w:t>Kubernetes</w:t>
+      </w:r>
+      <w:r>
+        <w:rPr>
+          <w:rFonts w:asciiTheme="majorBidi" w:hAnsiTheme="majorBidi" w:cstheme="majorBidi"/>
+          <w:sz w:val="28"/>
+          <w:szCs w:val="28"/>
+        </w:rPr>
+        <w:t xml:space="preserve"> works with </w:t>
+      </w:r>
+      <w:proofErr w:type="spellStart"/>
+      <w:r>
+        <w:rPr>
+          <w:rFonts w:asciiTheme="majorBidi" w:hAnsiTheme="majorBidi" w:cstheme="majorBidi"/>
+          <w:sz w:val="28"/>
+          <w:szCs w:val="28"/>
+        </w:rPr>
+        <w:t>containerd</w:t>
+      </w:r>
+      <w:proofErr w:type="spellEnd"/>
+      <w:r>
+        <w:rPr>
+          <w:rFonts w:asciiTheme="majorBidi" w:hAnsiTheme="majorBidi" w:cstheme="majorBidi"/>
+          <w:sz w:val="28"/>
+          <w:szCs w:val="28"/>
+        </w:rPr>
+        <w:t xml:space="preserve"> because Kubernetes itself is the control plane. It provides orchestration, networking abstraction (CNI), secrets, scaling, scheduling, and cluster state. </w:t>
+      </w:r>
+      <w:proofErr w:type="gramStart"/>
+      <w:r>
+        <w:rPr>
+          <w:rFonts w:asciiTheme="majorBidi" w:hAnsiTheme="majorBidi" w:cstheme="majorBidi"/>
+          <w:sz w:val="28"/>
+          <w:szCs w:val="28"/>
+        </w:rPr>
+        <w:t>So</w:t>
+      </w:r>
+      <w:proofErr w:type="gramEnd"/>
+      <w:r>
+        <w:rPr>
+          <w:rFonts w:asciiTheme="majorBidi" w:hAnsiTheme="majorBidi" w:cstheme="majorBidi"/>
+          <w:sz w:val="28"/>
+          <w:szCs w:val="28"/>
+        </w:rPr>
+        <w:t xml:space="preserve"> Kubernetes does not need Docker daemon — it already is the higher layer.</w:t>
+      </w:r>
+    </w:p>
+    <w:p>
+      <w:pPr>
+        <w:jc w:val="both"/>
+        <w:rPr>
+          <w:rFonts w:asciiTheme="majorBidi" w:hAnsiTheme="majorBidi" w:cstheme="majorBidi"/>
+          <w:sz w:val="28"/>
+          <w:szCs w:val="28"/>
+        </w:rPr>
+      </w:pPr>
+      <w:r>
+        <w:rPr>
+          <w:rFonts w:asciiTheme="majorBidi" w:hAnsiTheme="majorBidi" w:cstheme="majorBidi"/>
+          <w:sz w:val="28"/>
+          <w:szCs w:val="28"/>
+        </w:rPr>
+        <w:t>Docker daemon exists for environments where you want:</w:t>
+      </w:r>
+    </w:p>
+    <w:p>
+      <w:pPr>
+        <w:pStyle w:val="ListParagraph"/>
+        <w:numPr>
+          <w:ilvl w:val="0"/>
+          <w:numId w:val="62"/>
+        </w:numPr>
+        <w:ind w:left="360"/>
+        <w:jc w:val="both"/>
+        <w:rPr>
+          <w:rFonts w:asciiTheme="majorBidi" w:hAnsiTheme="majorBidi" w:cstheme="majorBidi"/>
+          <w:sz w:val="28"/>
+          <w:szCs w:val="28"/>
+        </w:rPr>
+      </w:pPr>
+      <w:r>
+        <w:rPr>
+          <w:rFonts w:asciiTheme="majorBidi" w:hAnsiTheme="majorBidi" w:cstheme="majorBidi"/>
+          <w:sz w:val="28"/>
+          <w:szCs w:val="28"/>
+        </w:rPr>
+        <w:t>A complete local developer platform</w:t>
+      </w:r>
+    </w:p>
+    <w:p>
+      <w:pPr>
+        <w:pStyle w:val="ListParagraph"/>
+        <w:numPr>
+          <w:ilvl w:val="0"/>
+          <w:numId w:val="62"/>
+        </w:numPr>
+        <w:ind w:left="360"/>
+        <w:jc w:val="both"/>
+        <w:rPr>
+          <w:rFonts w:asciiTheme="majorBidi" w:hAnsiTheme="majorBidi" w:cstheme="majorBidi"/>
+          <w:sz w:val="28"/>
+          <w:szCs w:val="28"/>
+        </w:rPr>
+      </w:pPr>
+      <w:r>
+        <w:rPr>
+          <w:rFonts w:asciiTheme="majorBidi" w:hAnsiTheme="majorBidi" w:cstheme="majorBidi"/>
+          <w:sz w:val="28"/>
+          <w:szCs w:val="28"/>
+        </w:rPr>
+        <w:t>Simple container lifecycle management</w:t>
+      </w:r>
+    </w:p>
+    <w:p>
+      <w:pPr>
+        <w:pStyle w:val="ListParagraph"/>
+        <w:numPr>
+          <w:ilvl w:val="0"/>
+          <w:numId w:val="62"/>
+        </w:numPr>
+        <w:ind w:left="360"/>
+        <w:jc w:val="both"/>
+        <w:rPr>
+          <w:rFonts w:asciiTheme="majorBidi" w:hAnsiTheme="majorBidi" w:cstheme="majorBidi"/>
+          <w:sz w:val="28"/>
+          <w:szCs w:val="28"/>
+        </w:rPr>
+      </w:pPr>
+      <w:r>
+        <w:rPr>
+          <w:rFonts w:asciiTheme="majorBidi" w:hAnsiTheme="majorBidi" w:cstheme="majorBidi"/>
+          <w:sz w:val="28"/>
+          <w:szCs w:val="28"/>
+        </w:rPr>
+        <w:t>Integrated build system</w:t>
+      </w:r>
+    </w:p>
+    <w:p>
+      <w:pPr>
+        <w:pStyle w:val="ListParagraph"/>
+        <w:numPr>
+          <w:ilvl w:val="0"/>
+          <w:numId w:val="62"/>
+        </w:numPr>
+        <w:ind w:left="360"/>
+        <w:jc w:val="both"/>
+        <w:rPr>
+          <w:rFonts w:asciiTheme="majorBidi" w:hAnsiTheme="majorBidi" w:cstheme="majorBidi"/>
+          <w:sz w:val="28"/>
+          <w:szCs w:val="28"/>
+        </w:rPr>
+      </w:pPr>
+      <w:r>
+        <w:rPr>
+          <w:rFonts w:asciiTheme="majorBidi" w:hAnsiTheme="majorBidi" w:cstheme="majorBidi"/>
+          <w:sz w:val="28"/>
+          <w:szCs w:val="28"/>
+        </w:rPr>
+        <w:t>Integrated networking</w:t>
+      </w:r>
+    </w:p>
+    <w:p>
+      <w:pPr>
+        <w:pStyle w:val="ListParagraph"/>
+        <w:numPr>
+          <w:ilvl w:val="0"/>
+          <w:numId w:val="62"/>
+        </w:numPr>
+        <w:ind w:left="360"/>
+        <w:jc w:val="both"/>
+        <w:rPr>
+          <w:rFonts w:asciiTheme="majorBidi" w:hAnsiTheme="majorBidi" w:cstheme="majorBidi"/>
+          <w:sz w:val="28"/>
+          <w:szCs w:val="28"/>
+        </w:rPr>
+      </w:pPr>
+      <w:r>
+        <w:rPr>
+          <w:rFonts w:asciiTheme="majorBidi" w:hAnsiTheme="majorBidi" w:cstheme="majorBidi"/>
+          <w:sz w:val="28"/>
+          <w:szCs w:val="28"/>
+        </w:rPr>
+        <w:t>Integrated image workflow</w:t>
+      </w:r>
+    </w:p>
+    <w:p>
+      <w:pPr>
+        <w:pStyle w:val="ListParagraph"/>
+        <w:numPr>
+          <w:ilvl w:val="0"/>
+          <w:numId w:val="62"/>
+        </w:numPr>
+        <w:ind w:left="360"/>
+        <w:jc w:val="both"/>
+        <w:rPr>
+          <w:rFonts w:asciiTheme="majorBidi" w:hAnsiTheme="majorBidi" w:cstheme="majorBidi"/>
+          <w:sz w:val="28"/>
+          <w:szCs w:val="28"/>
+        </w:rPr>
+      </w:pPr>
+      <w:r>
+        <w:rPr>
+          <w:rFonts w:asciiTheme="majorBidi" w:hAnsiTheme="majorBidi" w:cstheme="majorBidi"/>
+          <w:sz w:val="28"/>
+          <w:szCs w:val="28"/>
+        </w:rPr>
+        <w:t>Swarm orchestration</w:t>
+      </w:r>
+    </w:p>
+    <w:p>
+      <w:pPr>
+        <w:pStyle w:val="ListParagraph"/>
+        <w:numPr>
+          <w:ilvl w:val="0"/>
+          <w:numId w:val="62"/>
+        </w:numPr>
+        <w:ind w:left="360"/>
+        <w:jc w:val="both"/>
+        <w:rPr>
+          <w:rFonts w:asciiTheme="majorBidi" w:hAnsiTheme="majorBidi" w:cstheme="majorBidi"/>
+          <w:sz w:val="28"/>
+          <w:szCs w:val="28"/>
+        </w:rPr>
+      </w:pPr>
+      <w:r>
+        <w:rPr>
+          <w:rFonts w:asciiTheme="majorBidi" w:hAnsiTheme="majorBidi" w:cstheme="majorBidi"/>
+          <w:sz w:val="28"/>
+          <w:szCs w:val="28"/>
+        </w:rPr>
+        <w:t>Consistent API endpoint</w:t>
+      </w:r>
+    </w:p>
+    <w:p>
+      <w:pPr>
+        <w:jc w:val="both"/>
+        <w:rPr>
+          <w:rFonts w:asciiTheme="majorBidi" w:hAnsiTheme="majorBidi" w:cstheme="majorBidi"/>
+          <w:sz w:val="28"/>
+          <w:szCs w:val="28"/>
+        </w:rPr>
+      </w:pPr>
+      <w:r>
+        <w:rPr>
+          <w:rFonts w:asciiTheme="majorBidi" w:hAnsiTheme="majorBidi" w:cstheme="majorBidi"/>
+          <w:sz w:val="28"/>
+          <w:szCs w:val="28"/>
+        </w:rPr>
+        <w:t xml:space="preserve">If you already have a control plane (Kubernetes), </w:t>
+      </w:r>
+      <w:proofErr w:type="spellStart"/>
+      <w:r>
+        <w:rPr>
+          <w:rFonts w:asciiTheme="majorBidi" w:hAnsiTheme="majorBidi" w:cstheme="majorBidi"/>
+          <w:sz w:val="28"/>
+          <w:szCs w:val="28"/>
+        </w:rPr>
+        <w:t>containerd</w:t>
+      </w:r>
+      <w:proofErr w:type="spellEnd"/>
+      <w:r>
+        <w:rPr>
+          <w:rFonts w:asciiTheme="majorBidi" w:hAnsiTheme="majorBidi" w:cstheme="majorBidi"/>
+          <w:sz w:val="28"/>
+          <w:szCs w:val="28"/>
+        </w:rPr>
+        <w:t xml:space="preserve"> is enough.</w:t>
+      </w:r>
+      <w:r>
+        <w:rPr>
+          <w:rFonts w:asciiTheme="majorBidi" w:hAnsiTheme="majorBidi" w:cstheme="majorBidi"/>
+          <w:sz w:val="28"/>
+          <w:szCs w:val="28"/>
+        </w:rPr>
+        <w:t xml:space="preserve"> </w:t>
+      </w:r>
+      <w:r>
+        <w:rPr>
+          <w:rFonts w:asciiTheme="majorBidi" w:hAnsiTheme="majorBidi" w:cstheme="majorBidi"/>
+          <w:sz w:val="28"/>
+          <w:szCs w:val="28"/>
+        </w:rPr>
+        <w:t>If you do not have a control plane and want an integrated developer platform, Docker daemon provides it.</w:t>
+      </w:r>
+    </w:p>
+    <w:p>
+      <w:pPr>
+        <w:jc w:val="both"/>
+        <w:rPr>
+          <w:rFonts w:asciiTheme="majorBidi" w:hAnsiTheme="majorBidi" w:cstheme="majorBidi"/>
+          <w:sz w:val="28"/>
+          <w:szCs w:val="28"/>
+        </w:rPr>
+      </w:pPr>
+      <w:r>
+        <w:rPr>
+          <w:rFonts w:asciiTheme="majorBidi" w:hAnsiTheme="majorBidi" w:cstheme="majorBidi"/>
+          <w:sz w:val="28"/>
+          <w:szCs w:val="28"/>
+        </w:rPr>
+        <w:t xml:space="preserve">Now compare that to </w:t>
+      </w:r>
+      <w:proofErr w:type="spellStart"/>
+      <w:r>
+        <w:rPr>
+          <w:rFonts w:asciiTheme="majorBidi" w:hAnsiTheme="majorBidi" w:cstheme="majorBidi"/>
+          <w:sz w:val="28"/>
+          <w:szCs w:val="28"/>
+        </w:rPr>
+        <w:t>daemonless</w:t>
+      </w:r>
+      <w:proofErr w:type="spellEnd"/>
+      <w:r>
+        <w:rPr>
+          <w:rFonts w:asciiTheme="majorBidi" w:hAnsiTheme="majorBidi" w:cstheme="majorBidi"/>
+          <w:sz w:val="28"/>
+          <w:szCs w:val="28"/>
+        </w:rPr>
+        <w:t xml:space="preserve"> tools like </w:t>
+      </w:r>
+      <w:proofErr w:type="spellStart"/>
+      <w:r>
+        <w:rPr>
+          <w:rFonts w:asciiTheme="majorBidi" w:hAnsiTheme="majorBidi" w:cstheme="majorBidi"/>
+          <w:sz w:val="28"/>
+          <w:szCs w:val="28"/>
+        </w:rPr>
+        <w:t>Podman</w:t>
+      </w:r>
+      <w:proofErr w:type="spellEnd"/>
+      <w:r>
+        <w:rPr>
+          <w:rFonts w:asciiTheme="majorBidi" w:hAnsiTheme="majorBidi" w:cstheme="majorBidi"/>
+          <w:sz w:val="28"/>
+          <w:szCs w:val="28"/>
+        </w:rPr>
+        <w:t xml:space="preserve">. </w:t>
+      </w:r>
+      <w:proofErr w:type="spellStart"/>
+      <w:r>
+        <w:rPr>
+          <w:rFonts w:asciiTheme="majorBidi" w:hAnsiTheme="majorBidi" w:cstheme="majorBidi"/>
+          <w:sz w:val="28"/>
+          <w:szCs w:val="28"/>
+        </w:rPr>
+        <w:t>Podman</w:t>
+      </w:r>
+      <w:proofErr w:type="spellEnd"/>
+      <w:r>
+        <w:rPr>
+          <w:rFonts w:asciiTheme="majorBidi" w:hAnsiTheme="majorBidi" w:cstheme="majorBidi"/>
+          <w:sz w:val="28"/>
+          <w:szCs w:val="28"/>
+        </w:rPr>
+        <w:t xml:space="preserve"> works fine because it leans heavily on Linux primitives and </w:t>
+      </w:r>
+      <w:proofErr w:type="spellStart"/>
+      <w:r>
+        <w:rPr>
+          <w:rFonts w:asciiTheme="majorBidi" w:hAnsiTheme="majorBidi" w:cstheme="majorBidi"/>
+          <w:sz w:val="28"/>
+          <w:szCs w:val="28"/>
+        </w:rPr>
+        <w:t>systemd</w:t>
+      </w:r>
+      <w:proofErr w:type="spellEnd"/>
+      <w:r>
+        <w:rPr>
+          <w:rFonts w:asciiTheme="majorBidi" w:hAnsiTheme="majorBidi" w:cstheme="majorBidi"/>
+          <w:sz w:val="28"/>
+          <w:szCs w:val="28"/>
+        </w:rPr>
+        <w:t xml:space="preserve"> for supervision. But </w:t>
+      </w:r>
+      <w:proofErr w:type="spellStart"/>
+      <w:r>
+        <w:rPr>
+          <w:rFonts w:asciiTheme="majorBidi" w:hAnsiTheme="majorBidi" w:cstheme="majorBidi"/>
+          <w:sz w:val="28"/>
+          <w:szCs w:val="28"/>
+        </w:rPr>
+        <w:t>Podman</w:t>
+      </w:r>
+      <w:proofErr w:type="spellEnd"/>
+      <w:r>
+        <w:rPr>
+          <w:rFonts w:asciiTheme="majorBidi" w:hAnsiTheme="majorBidi" w:cstheme="majorBidi"/>
+          <w:sz w:val="28"/>
+          <w:szCs w:val="28"/>
+        </w:rPr>
+        <w:t xml:space="preserve"> does not aim to be a full orchestration platform like Docker Swarm, nor does it expose the same centralized API model by default.</w:t>
+      </w:r>
+    </w:p>
+    <w:p>
+      <w:pPr>
+        <w:jc w:val="both"/>
+        <w:rPr>
+          <w:rFonts w:asciiTheme="majorBidi" w:hAnsiTheme="majorBidi" w:cstheme="majorBidi"/>
+          <w:b/>
+          <w:bCs/>
+          <w:sz w:val="32"/>
+          <w:szCs w:val="32"/>
+        </w:rPr>
+      </w:pPr>
+      <w:r>
+        <w:rPr>
+          <w:rFonts w:asciiTheme="majorBidi" w:hAnsiTheme="majorBidi" w:cstheme="majorBidi"/>
+          <w:b/>
+          <w:bCs/>
+          <w:sz w:val="32"/>
+          <w:szCs w:val="32"/>
+        </w:rPr>
+        <w:t>W</w:t>
+      </w:r>
+      <w:r>
+        <w:rPr>
+          <w:rFonts w:asciiTheme="majorBidi" w:hAnsiTheme="majorBidi" w:cstheme="majorBidi"/>
+          <w:b/>
+          <w:bCs/>
+          <w:sz w:val="32"/>
+          <w:szCs w:val="32"/>
+        </w:rPr>
+        <w:t xml:space="preserve">hy </w:t>
+      </w:r>
+      <w:proofErr w:type="spellStart"/>
+      <w:r>
+        <w:rPr>
+          <w:rFonts w:asciiTheme="majorBidi" w:hAnsiTheme="majorBidi" w:cstheme="majorBidi"/>
+          <w:b/>
+          <w:bCs/>
+          <w:sz w:val="32"/>
+          <w:szCs w:val="32"/>
+        </w:rPr>
+        <w:t>kubernetes</w:t>
+      </w:r>
+      <w:proofErr w:type="spellEnd"/>
+      <w:r>
+        <w:rPr>
+          <w:rFonts w:asciiTheme="majorBidi" w:hAnsiTheme="majorBidi" w:cstheme="majorBidi"/>
+          <w:b/>
+          <w:bCs/>
+          <w:sz w:val="32"/>
+          <w:szCs w:val="32"/>
+        </w:rPr>
+        <w:t xml:space="preserve"> </w:t>
+      </w:r>
+      <w:proofErr w:type="spellStart"/>
+      <w:r>
+        <w:rPr>
+          <w:rFonts w:asciiTheme="majorBidi" w:hAnsiTheme="majorBidi" w:cstheme="majorBidi"/>
+          <w:b/>
+          <w:bCs/>
+          <w:sz w:val="32"/>
+          <w:szCs w:val="32"/>
+        </w:rPr>
+        <w:t>doesnt</w:t>
+      </w:r>
+      <w:proofErr w:type="spellEnd"/>
+      <w:r>
+        <w:rPr>
+          <w:rFonts w:asciiTheme="majorBidi" w:hAnsiTheme="majorBidi" w:cstheme="majorBidi"/>
+          <w:b/>
+          <w:bCs/>
+          <w:sz w:val="32"/>
+          <w:szCs w:val="32"/>
+        </w:rPr>
+        <w:t xml:space="preserve"> use </w:t>
+      </w:r>
+      <w:proofErr w:type="spellStart"/>
+      <w:r>
+        <w:rPr>
+          <w:rFonts w:asciiTheme="majorBidi" w:hAnsiTheme="majorBidi" w:cstheme="majorBidi"/>
+          <w:b/>
+          <w:bCs/>
+          <w:sz w:val="32"/>
+          <w:szCs w:val="32"/>
+        </w:rPr>
+        <w:t>po</w:t>
+      </w:r>
+      <w:r>
+        <w:rPr>
+          <w:rFonts w:asciiTheme="majorBidi" w:hAnsiTheme="majorBidi" w:cstheme="majorBidi"/>
+          <w:b/>
+          <w:bCs/>
+          <w:sz w:val="32"/>
+          <w:szCs w:val="32"/>
+        </w:rPr>
+        <w:t>d</w:t>
+      </w:r>
+      <w:r>
+        <w:rPr>
+          <w:rFonts w:asciiTheme="majorBidi" w:hAnsiTheme="majorBidi" w:cstheme="majorBidi"/>
+          <w:b/>
+          <w:bCs/>
+          <w:sz w:val="32"/>
+          <w:szCs w:val="32"/>
+        </w:rPr>
+        <w:t>man</w:t>
+      </w:r>
+      <w:proofErr w:type="spellEnd"/>
+      <w:r>
+        <w:rPr>
+          <w:rFonts w:asciiTheme="majorBidi" w:hAnsiTheme="majorBidi" w:cstheme="majorBidi"/>
+          <w:b/>
+          <w:bCs/>
+          <w:sz w:val="32"/>
+          <w:szCs w:val="32"/>
+        </w:rPr>
+        <w:t>?</w:t>
+      </w:r>
+    </w:p>
+    <w:p>
+      <w:pPr>
+        <w:jc w:val="both"/>
+        <w:rPr>
+          <w:rFonts w:asciiTheme="majorBidi" w:hAnsiTheme="majorBidi" w:cstheme="majorBidi"/>
+          <w:sz w:val="28"/>
+          <w:szCs w:val="28"/>
+        </w:rPr>
+      </w:pPr>
+      <w:r>
+        <w:rPr>
+          <w:rFonts w:asciiTheme="majorBidi" w:hAnsiTheme="majorBidi" w:cstheme="majorBidi"/>
+          <w:sz w:val="28"/>
+          <w:szCs w:val="28"/>
+        </w:rPr>
+        <w:t xml:space="preserve">Kubernetes does not use </w:t>
+      </w:r>
+      <w:proofErr w:type="spellStart"/>
+      <w:r>
+        <w:rPr>
+          <w:rFonts w:asciiTheme="majorBidi" w:hAnsiTheme="majorBidi" w:cstheme="majorBidi"/>
+          <w:sz w:val="28"/>
+          <w:szCs w:val="28"/>
+        </w:rPr>
+        <w:t>Podman</w:t>
+      </w:r>
+      <w:proofErr w:type="spellEnd"/>
+      <w:r>
+        <w:rPr>
+          <w:rFonts w:asciiTheme="majorBidi" w:hAnsiTheme="majorBidi" w:cstheme="majorBidi"/>
+          <w:sz w:val="28"/>
+          <w:szCs w:val="28"/>
+        </w:rPr>
+        <w:t xml:space="preserve"> because Kubernetes talks to runtimes through the CRI (Container Runtime Interface), and </w:t>
+      </w:r>
+      <w:proofErr w:type="spellStart"/>
+      <w:r>
+        <w:rPr>
+          <w:rFonts w:asciiTheme="majorBidi" w:hAnsiTheme="majorBidi" w:cstheme="majorBidi"/>
+          <w:sz w:val="28"/>
+          <w:szCs w:val="28"/>
+        </w:rPr>
+        <w:t>Podman</w:t>
+      </w:r>
+      <w:proofErr w:type="spellEnd"/>
+      <w:r>
+        <w:rPr>
+          <w:rFonts w:asciiTheme="majorBidi" w:hAnsiTheme="majorBidi" w:cstheme="majorBidi"/>
+          <w:sz w:val="28"/>
+          <w:szCs w:val="28"/>
+        </w:rPr>
+        <w:t xml:space="preserve"> is primarily a CLI tool for managing containers, not a CRI runtime daemon. Kubernetes needs something that runs persistently on each node and implements CRI cleanly. That is why it commonly uses </w:t>
+      </w:r>
+      <w:proofErr w:type="spellStart"/>
+      <w:r>
+        <w:rPr>
+          <w:rFonts w:asciiTheme="majorBidi" w:hAnsiTheme="majorBidi" w:cstheme="majorBidi"/>
+          <w:sz w:val="28"/>
+          <w:szCs w:val="28"/>
+        </w:rPr>
+        <w:t>containerd</w:t>
+      </w:r>
+      <w:proofErr w:type="spellEnd"/>
+      <w:r>
+        <w:rPr>
+          <w:rFonts w:asciiTheme="majorBidi" w:hAnsiTheme="majorBidi" w:cstheme="majorBidi"/>
+          <w:sz w:val="28"/>
+          <w:szCs w:val="28"/>
+        </w:rPr>
+        <w:t xml:space="preserve"> or CRI-O. </w:t>
+      </w:r>
+      <w:proofErr w:type="spellStart"/>
+      <w:r>
+        <w:rPr>
+          <w:rFonts w:asciiTheme="majorBidi" w:hAnsiTheme="majorBidi" w:cstheme="majorBidi"/>
+          <w:sz w:val="28"/>
+          <w:szCs w:val="28"/>
+        </w:rPr>
+        <w:t>Podman</w:t>
+      </w:r>
+      <w:proofErr w:type="spellEnd"/>
+      <w:r>
+        <w:rPr>
+          <w:rFonts w:asciiTheme="majorBidi" w:hAnsiTheme="majorBidi" w:cstheme="majorBidi"/>
+          <w:sz w:val="28"/>
+          <w:szCs w:val="28"/>
+        </w:rPr>
+        <w:t xml:space="preserve"> is great for users and rootless workflows, but it was not designed to be the node-level runtime that Kubernetes expects.</w:t>
+      </w:r>
+    </w:p>
+    <w:p>
+      <w:pPr>
         <w:pStyle w:val="ListParagraph"/>
         <w:numPr>
           <w:ilvl w:val="0"/>
@@ -15728,15 +17157,27 @@
           <w:szCs w:val="28"/>
         </w:rPr>
       </w:pPr>
-      <w:r>
-        <w:rPr>
-          <w:rFonts w:asciiTheme="majorBidi" w:hAnsiTheme="majorBidi" w:cstheme="majorBidi"/>
-          <w:sz w:val="28"/>
-          <w:szCs w:val="28"/>
-        </w:rPr>
-        <w:t xml:space="preserve">If you look at modern Docker architecture and see that </w:t>
-      </w:r>
       <w:proofErr w:type="spellStart"/>
+      <w:proofErr w:type="gramStart"/>
+      <w:r>
+        <w:rPr>
+          <w:rFonts w:asciiTheme="majorBidi" w:hAnsiTheme="majorBidi" w:cstheme="majorBidi"/>
+          <w:sz w:val="28"/>
+          <w:szCs w:val="28"/>
+        </w:rPr>
+        <w:t>If</w:t>
+      </w:r>
+      <w:proofErr w:type="spellEnd"/>
+      <w:proofErr w:type="gramEnd"/>
+      <w:r>
+        <w:rPr>
+          <w:rFonts w:asciiTheme="majorBidi" w:hAnsiTheme="majorBidi" w:cstheme="majorBidi"/>
+          <w:sz w:val="28"/>
+          <w:szCs w:val="28"/>
+        </w:rPr>
+        <w:t xml:space="preserve"> you look at modern Docker architecture and see that </w:t>
+      </w:r>
+      <w:proofErr w:type="spellStart"/>
       <w:r>
         <w:rPr>
           <w:rFonts w:asciiTheme="majorBidi" w:hAnsiTheme="majorBidi" w:cstheme="majorBidi"/>
@@ -15824,7 +17265,16 @@
           <w:sz w:val="28"/>
           <w:szCs w:val="28"/>
         </w:rPr>
-        <w:t xml:space="preserve"> is not a low-level container creator anymore; it is the high-level control plane of the Docker platform. It exposes and manages the Docker REST API over Unix socket or TCP, handles authentication and authorization (including TLS, registry credentials, and access to the Docker socket), manages images (pull, push, tag, prune), coordinates image building through </w:t>
+        <w:t xml:space="preserve"> is not a low-level container creator anymore; it is </w:t>
+      </w:r>
+      <w:r>
+        <w:rPr>
+          <w:rFonts w:asciiTheme="majorBidi" w:hAnsiTheme="majorBidi" w:cstheme="majorBidi"/>
+          <w:sz w:val="28"/>
+          <w:szCs w:val="28"/>
+        </w:rPr>
+        <w:lastRenderedPageBreak/>
+        <w:t xml:space="preserve">the high-level control plane of the Docker platform. It exposes and manages the Docker REST API over Unix socket or TCP, handles authentication and authorization (including TLS, registry credentials, and access to the Docker socket), manages images (pull, push, tag, prune), coordinates image building through </w:t>
       </w:r>
       <w:proofErr w:type="spellStart"/>
       <w:r>
@@ -16798,6 +18248,119 @@
     </w:lvl>
   </w:abstractNum>
   <w:abstractNum w:abstractNumId="8" w15:restartNumberingAfterBreak="0">
+    <w:nsid w:val="0F601ABA"/>
+    <w:multiLevelType w:val="hybridMultilevel"/>
+    <w:tmpl w:val="F3D4ACA8"/>
+    <w:lvl w:ilvl="0" w:tplc="04090001">
+      <w:start w:val="1"/>
+      <w:numFmt w:val="bullet"/>
+      <w:lvlText w:val=""/>
+      <w:lvlJc w:val="left"/>
+      <w:pPr>
+        <w:ind w:left="720" w:hanging="360"/>
+      </w:pPr>
+      <w:rPr>
+        <w:rFonts w:ascii="Symbol" w:hAnsi="Symbol" w:hint="default"/>
+      </w:rPr>
+    </w:lvl>
+    <w:lvl w:ilvl="1" w:tplc="04090003" w:tentative="1">
+      <w:start w:val="1"/>
+      <w:numFmt w:val="bullet"/>
+      <w:lvlText w:val="o"/>
+      <w:lvlJc w:val="left"/>
+      <w:pPr>
+        <w:ind w:left="1440" w:hanging="360"/>
+      </w:pPr>
+      <w:rPr>
+        <w:rFonts w:ascii="Courier New" w:hAnsi="Courier New" w:cs="Courier New" w:hint="default"/>
+      </w:rPr>
+    </w:lvl>
+    <w:lvl w:ilvl="2" w:tplc="04090005" w:tentative="1">
+      <w:start w:val="1"/>
+      <w:numFmt w:val="bullet"/>
+      <w:lvlText w:val=""/>
+      <w:lvlJc w:val="left"/>
+      <w:pPr>
+        <w:ind w:left="2160" w:hanging="360"/>
+      </w:pPr>
+      <w:rPr>
+        <w:rFonts w:ascii="Wingdings" w:hAnsi="Wingdings" w:hint="default"/>
+      </w:rPr>
+    </w:lvl>
+    <w:lvl w:ilvl="3" w:tplc="04090001" w:tentative="1">
+      <w:start w:val="1"/>
+      <w:numFmt w:val="bullet"/>
+      <w:lvlText w:val=""/>
+      <w:lvlJc w:val="left"/>
+      <w:pPr>
+        <w:ind w:left="2880" w:hanging="360"/>
+      </w:pPr>
+      <w:rPr>
+        <w:rFonts w:ascii="Symbol" w:hAnsi="Symbol" w:hint="default"/>
+      </w:rPr>
+    </w:lvl>
+    <w:lvl w:ilvl="4" w:tplc="04090003" w:tentative="1">
+      <w:start w:val="1"/>
+      <w:numFmt w:val="bullet"/>
+      <w:lvlText w:val="o"/>
+      <w:lvlJc w:val="left"/>
+      <w:pPr>
+        <w:ind w:left="3600" w:hanging="360"/>
+      </w:pPr>
+      <w:rPr>
+        <w:rFonts w:ascii="Courier New" w:hAnsi="Courier New" w:cs="Courier New" w:hint="default"/>
+      </w:rPr>
+    </w:lvl>
+    <w:lvl w:ilvl="5" w:tplc="04090005" w:tentative="1">
+      <w:start w:val="1"/>
+      <w:numFmt w:val="bullet"/>
+      <w:lvlText w:val=""/>
+      <w:lvlJc w:val="left"/>
+      <w:pPr>
+        <w:ind w:left="4320" w:hanging="360"/>
+      </w:pPr>
+      <w:rPr>
+        <w:rFonts w:ascii="Wingdings" w:hAnsi="Wingdings" w:hint="default"/>
+      </w:rPr>
+    </w:lvl>
+    <w:lvl w:ilvl="6" w:tplc="04090001" w:tentative="1">
+      <w:start w:val="1"/>
+      <w:numFmt w:val="bullet"/>
+      <w:lvlText w:val=""/>
+      <w:lvlJc w:val="left"/>
+      <w:pPr>
+        <w:ind w:left="5040" w:hanging="360"/>
+      </w:pPr>
+      <w:rPr>
+        <w:rFonts w:ascii="Symbol" w:hAnsi="Symbol" w:hint="default"/>
+      </w:rPr>
+    </w:lvl>
+    <w:lvl w:ilvl="7" w:tplc="04090003" w:tentative="1">
+      <w:start w:val="1"/>
+      <w:numFmt w:val="bullet"/>
+      <w:lvlText w:val="o"/>
+      <w:lvlJc w:val="left"/>
+      <w:pPr>
+        <w:ind w:left="5760" w:hanging="360"/>
+      </w:pPr>
+      <w:rPr>
+        <w:rFonts w:ascii="Courier New" w:hAnsi="Courier New" w:cs="Courier New" w:hint="default"/>
+      </w:rPr>
+    </w:lvl>
+    <w:lvl w:ilvl="8" w:tplc="04090005" w:tentative="1">
+      <w:start w:val="1"/>
+      <w:numFmt w:val="bullet"/>
+      <w:lvlText w:val=""/>
+      <w:lvlJc w:val="left"/>
+      <w:pPr>
+        <w:ind w:left="6480" w:hanging="360"/>
+      </w:pPr>
+      <w:rPr>
+        <w:rFonts w:ascii="Wingdings" w:hAnsi="Wingdings" w:hint="default"/>
+      </w:rPr>
+    </w:lvl>
+  </w:abstractNum>
+  <w:abstractNum w:abstractNumId="9" w15:restartNumberingAfterBreak="0">
     <w:nsid w:val="0F724923"/>
     <w:multiLevelType w:val="hybridMultilevel"/>
     <w:tmpl w:val="0FDA852C"/>
@@ -16910,7 +18473,7 @@
       </w:rPr>
     </w:lvl>
   </w:abstractNum>
-  <w:abstractNum w:abstractNumId="9" w15:restartNumberingAfterBreak="0">
+  <w:abstractNum w:abstractNumId="10" w15:restartNumberingAfterBreak="0">
     <w:nsid w:val="119C5127"/>
     <w:multiLevelType w:val="hybridMultilevel"/>
     <w:tmpl w:val="29BC7C88"/>
@@ -17023,7 +18586,7 @@
       </w:rPr>
     </w:lvl>
   </w:abstractNum>
-  <w:abstractNum w:abstractNumId="10" w15:restartNumberingAfterBreak="0">
+  <w:abstractNum w:abstractNumId="11" w15:restartNumberingAfterBreak="0">
     <w:nsid w:val="11E41729"/>
     <w:multiLevelType w:val="hybridMultilevel"/>
     <w:tmpl w:val="5ABA1398"/>
@@ -17136,7 +18699,7 @@
       </w:rPr>
     </w:lvl>
   </w:abstractNum>
-  <w:abstractNum w:abstractNumId="11" w15:restartNumberingAfterBreak="0">
+  <w:abstractNum w:abstractNumId="12" w15:restartNumberingAfterBreak="0">
     <w:nsid w:val="143C6BD0"/>
     <w:multiLevelType w:val="hybridMultilevel"/>
     <w:tmpl w:val="D804A9F2"/>
@@ -17249,7 +18812,7 @@
       </w:rPr>
     </w:lvl>
   </w:abstractNum>
-  <w:abstractNum w:abstractNumId="12" w15:restartNumberingAfterBreak="0">
+  <w:abstractNum w:abstractNumId="13" w15:restartNumberingAfterBreak="0">
     <w:nsid w:val="14A8188E"/>
     <w:multiLevelType w:val="hybridMultilevel"/>
     <w:tmpl w:val="AAA2A268"/>
@@ -17362,7 +18925,7 @@
       </w:rPr>
     </w:lvl>
   </w:abstractNum>
-  <w:abstractNum w:abstractNumId="13" w15:restartNumberingAfterBreak="0">
+  <w:abstractNum w:abstractNumId="14" w15:restartNumberingAfterBreak="0">
     <w:nsid w:val="15B2768B"/>
     <w:multiLevelType w:val="hybridMultilevel"/>
     <w:tmpl w:val="E910B0F2"/>
@@ -17475,7 +19038,7 @@
       </w:rPr>
     </w:lvl>
   </w:abstractNum>
-  <w:abstractNum w:abstractNumId="14" w15:restartNumberingAfterBreak="0">
+  <w:abstractNum w:abstractNumId="15" w15:restartNumberingAfterBreak="0">
     <w:nsid w:val="15E069CA"/>
     <w:multiLevelType w:val="hybridMultilevel"/>
     <w:tmpl w:val="7B169B72"/>
@@ -17588,7 +19151,7 @@
       </w:rPr>
     </w:lvl>
   </w:abstractNum>
-  <w:abstractNum w:abstractNumId="15" w15:restartNumberingAfterBreak="0">
+  <w:abstractNum w:abstractNumId="16" w15:restartNumberingAfterBreak="0">
     <w:nsid w:val="15EC305A"/>
     <w:multiLevelType w:val="hybridMultilevel"/>
     <w:tmpl w:val="3F38AAA6"/>
@@ -17701,10 +19264,10 @@
       </w:rPr>
     </w:lvl>
   </w:abstractNum>
-  <w:abstractNum w:abstractNumId="16" w15:restartNumberingAfterBreak="0">
+  <w:abstractNum w:abstractNumId="17" w15:restartNumberingAfterBreak="0">
     <w:nsid w:val="176653C0"/>
     <w:multiLevelType w:val="hybridMultilevel"/>
-    <w:tmpl w:val="2092EC22"/>
+    <w:tmpl w:val="08A05E28"/>
     <w:lvl w:ilvl="0" w:tplc="0409000D">
       <w:start w:val="1"/>
       <w:numFmt w:val="bullet"/>
@@ -17814,7 +19377,7 @@
       </w:rPr>
     </w:lvl>
   </w:abstractNum>
-  <w:abstractNum w:abstractNumId="17" w15:restartNumberingAfterBreak="0">
+  <w:abstractNum w:abstractNumId="18" w15:restartNumberingAfterBreak="0">
     <w:nsid w:val="1CCC70E7"/>
     <w:multiLevelType w:val="hybridMultilevel"/>
     <w:tmpl w:val="5F781118"/>
@@ -17927,7 +19490,7 @@
       </w:rPr>
     </w:lvl>
   </w:abstractNum>
-  <w:abstractNum w:abstractNumId="18" w15:restartNumberingAfterBreak="0">
+  <w:abstractNum w:abstractNumId="19" w15:restartNumberingAfterBreak="0">
     <w:nsid w:val="24B90396"/>
     <w:multiLevelType w:val="hybridMultilevel"/>
     <w:tmpl w:val="75469786"/>
@@ -18040,7 +19603,7 @@
       </w:rPr>
     </w:lvl>
   </w:abstractNum>
-  <w:abstractNum w:abstractNumId="19" w15:restartNumberingAfterBreak="0">
+  <w:abstractNum w:abstractNumId="20" w15:restartNumberingAfterBreak="0">
     <w:nsid w:val="26AC3E30"/>
     <w:multiLevelType w:val="hybridMultilevel"/>
     <w:tmpl w:val="D1FC649A"/>
@@ -18153,7 +19716,7 @@
       </w:rPr>
     </w:lvl>
   </w:abstractNum>
-  <w:abstractNum w:abstractNumId="20" w15:restartNumberingAfterBreak="0">
+  <w:abstractNum w:abstractNumId="21" w15:restartNumberingAfterBreak="0">
     <w:nsid w:val="290D16D4"/>
     <w:multiLevelType w:val="hybridMultilevel"/>
     <w:tmpl w:val="850CA056"/>
@@ -18239,7 +19802,7 @@
       </w:pPr>
     </w:lvl>
   </w:abstractNum>
-  <w:abstractNum w:abstractNumId="21" w15:restartNumberingAfterBreak="0">
+  <w:abstractNum w:abstractNumId="22" w15:restartNumberingAfterBreak="0">
     <w:nsid w:val="2A425DD0"/>
     <w:multiLevelType w:val="hybridMultilevel"/>
     <w:tmpl w:val="FC5CFAF2"/>
@@ -18325,7 +19888,7 @@
       </w:pPr>
     </w:lvl>
   </w:abstractNum>
-  <w:abstractNum w:abstractNumId="22" w15:restartNumberingAfterBreak="0">
+  <w:abstractNum w:abstractNumId="23" w15:restartNumberingAfterBreak="0">
     <w:nsid w:val="2B5F052B"/>
     <w:multiLevelType w:val="hybridMultilevel"/>
     <w:tmpl w:val="5030DC38"/>
@@ -18438,7 +20001,7 @@
       </w:rPr>
     </w:lvl>
   </w:abstractNum>
-  <w:abstractNum w:abstractNumId="23" w15:restartNumberingAfterBreak="0">
+  <w:abstractNum w:abstractNumId="24" w15:restartNumberingAfterBreak="0">
     <w:nsid w:val="2F9D4EBC"/>
     <w:multiLevelType w:val="hybridMultilevel"/>
     <w:tmpl w:val="75BE8682"/>
@@ -18551,7 +20114,7 @@
       </w:rPr>
     </w:lvl>
   </w:abstractNum>
-  <w:abstractNum w:abstractNumId="24" w15:restartNumberingAfterBreak="0">
+  <w:abstractNum w:abstractNumId="25" w15:restartNumberingAfterBreak="0">
     <w:nsid w:val="30B67E2F"/>
     <w:multiLevelType w:val="hybridMultilevel"/>
     <w:tmpl w:val="59660B40"/>
@@ -18664,7 +20227,7 @@
       </w:rPr>
     </w:lvl>
   </w:abstractNum>
-  <w:abstractNum w:abstractNumId="25" w15:restartNumberingAfterBreak="0">
+  <w:abstractNum w:abstractNumId="26" w15:restartNumberingAfterBreak="0">
     <w:nsid w:val="30E50561"/>
     <w:multiLevelType w:val="hybridMultilevel"/>
     <w:tmpl w:val="32B6F57E"/>
@@ -18777,7 +20340,120 @@
       </w:rPr>
     </w:lvl>
   </w:abstractNum>
-  <w:abstractNum w:abstractNumId="26" w15:restartNumberingAfterBreak="0">
+  <w:abstractNum w:abstractNumId="27" w15:restartNumberingAfterBreak="0">
+    <w:nsid w:val="356C252A"/>
+    <w:multiLevelType w:val="hybridMultilevel"/>
+    <w:tmpl w:val="56C642E8"/>
+    <w:lvl w:ilvl="0" w:tplc="04090001">
+      <w:start w:val="1"/>
+      <w:numFmt w:val="bullet"/>
+      <w:lvlText w:val=""/>
+      <w:lvlJc w:val="left"/>
+      <w:pPr>
+        <w:ind w:left="720" w:hanging="360"/>
+      </w:pPr>
+      <w:rPr>
+        <w:rFonts w:ascii="Symbol" w:hAnsi="Symbol" w:hint="default"/>
+      </w:rPr>
+    </w:lvl>
+    <w:lvl w:ilvl="1" w:tplc="FFFFFFFF" w:tentative="1">
+      <w:start w:val="1"/>
+      <w:numFmt w:val="bullet"/>
+      <w:lvlText w:val="o"/>
+      <w:lvlJc w:val="left"/>
+      <w:pPr>
+        <w:ind w:left="1440" w:hanging="360"/>
+      </w:pPr>
+      <w:rPr>
+        <w:rFonts w:ascii="Courier New" w:hAnsi="Courier New" w:cs="Courier New" w:hint="default"/>
+      </w:rPr>
+    </w:lvl>
+    <w:lvl w:ilvl="2" w:tplc="FFFFFFFF" w:tentative="1">
+      <w:start w:val="1"/>
+      <w:numFmt w:val="bullet"/>
+      <w:lvlText w:val=""/>
+      <w:lvlJc w:val="left"/>
+      <w:pPr>
+        <w:ind w:left="2160" w:hanging="360"/>
+      </w:pPr>
+      <w:rPr>
+        <w:rFonts w:ascii="Wingdings" w:hAnsi="Wingdings" w:hint="default"/>
+      </w:rPr>
+    </w:lvl>
+    <w:lvl w:ilvl="3" w:tplc="FFFFFFFF" w:tentative="1">
+      <w:start w:val="1"/>
+      <w:numFmt w:val="bullet"/>
+      <w:lvlText w:val=""/>
+      <w:lvlJc w:val="left"/>
+      <w:pPr>
+        <w:ind w:left="2880" w:hanging="360"/>
+      </w:pPr>
+      <w:rPr>
+        <w:rFonts w:ascii="Symbol" w:hAnsi="Symbol" w:hint="default"/>
+      </w:rPr>
+    </w:lvl>
+    <w:lvl w:ilvl="4" w:tplc="FFFFFFFF" w:tentative="1">
+      <w:start w:val="1"/>
+      <w:numFmt w:val="bullet"/>
+      <w:lvlText w:val="o"/>
+      <w:lvlJc w:val="left"/>
+      <w:pPr>
+        <w:ind w:left="3600" w:hanging="360"/>
+      </w:pPr>
+      <w:rPr>
+        <w:rFonts w:ascii="Courier New" w:hAnsi="Courier New" w:cs="Courier New" w:hint="default"/>
+      </w:rPr>
+    </w:lvl>
+    <w:lvl w:ilvl="5" w:tplc="FFFFFFFF" w:tentative="1">
+      <w:start w:val="1"/>
+      <w:numFmt w:val="bullet"/>
+      <w:lvlText w:val=""/>
+      <w:lvlJc w:val="left"/>
+      <w:pPr>
+        <w:ind w:left="4320" w:hanging="360"/>
+      </w:pPr>
+      <w:rPr>
+        <w:rFonts w:ascii="Wingdings" w:hAnsi="Wingdings" w:hint="default"/>
+      </w:rPr>
+    </w:lvl>
+    <w:lvl w:ilvl="6" w:tplc="FFFFFFFF" w:tentative="1">
+      <w:start w:val="1"/>
+      <w:numFmt w:val="bullet"/>
+      <w:lvlText w:val=""/>
+      <w:lvlJc w:val="left"/>
+      <w:pPr>
+        <w:ind w:left="5040" w:hanging="360"/>
+      </w:pPr>
+      <w:rPr>
+        <w:rFonts w:ascii="Symbol" w:hAnsi="Symbol" w:hint="default"/>
+      </w:rPr>
+    </w:lvl>
+    <w:lvl w:ilvl="7" w:tplc="FFFFFFFF" w:tentative="1">
+      <w:start w:val="1"/>
+      <w:numFmt w:val="bullet"/>
+      <w:lvlText w:val="o"/>
+      <w:lvlJc w:val="left"/>
+      <w:pPr>
+        <w:ind w:left="5760" w:hanging="360"/>
+      </w:pPr>
+      <w:rPr>
+        <w:rFonts w:ascii="Courier New" w:hAnsi="Courier New" w:cs="Courier New" w:hint="default"/>
+      </w:rPr>
+    </w:lvl>
+    <w:lvl w:ilvl="8" w:tplc="FFFFFFFF" w:tentative="1">
+      <w:start w:val="1"/>
+      <w:numFmt w:val="bullet"/>
+      <w:lvlText w:val=""/>
+      <w:lvlJc w:val="left"/>
+      <w:pPr>
+        <w:ind w:left="6480" w:hanging="360"/>
+      </w:pPr>
+      <w:rPr>
+        <w:rFonts w:ascii="Wingdings" w:hAnsi="Wingdings" w:hint="default"/>
+      </w:rPr>
+    </w:lvl>
+  </w:abstractNum>
+  <w:abstractNum w:abstractNumId="28" w15:restartNumberingAfterBreak="0">
     <w:nsid w:val="39984B4A"/>
     <w:multiLevelType w:val="hybridMultilevel"/>
     <w:tmpl w:val="4B9CFE62"/>
@@ -18890,7 +20566,7 @@
       </w:rPr>
     </w:lvl>
   </w:abstractNum>
-  <w:abstractNum w:abstractNumId="27" w15:restartNumberingAfterBreak="0">
+  <w:abstractNum w:abstractNumId="29" w15:restartNumberingAfterBreak="0">
     <w:nsid w:val="3BB13CD6"/>
     <w:multiLevelType w:val="hybridMultilevel"/>
     <w:tmpl w:val="38E65BE0"/>
@@ -19003,7 +20679,7 @@
       </w:rPr>
     </w:lvl>
   </w:abstractNum>
-  <w:abstractNum w:abstractNumId="28" w15:restartNumberingAfterBreak="0">
+  <w:abstractNum w:abstractNumId="30" w15:restartNumberingAfterBreak="0">
     <w:nsid w:val="3D8272C8"/>
     <w:multiLevelType w:val="hybridMultilevel"/>
     <w:tmpl w:val="69A42A26"/>
@@ -19116,7 +20792,7 @@
       </w:rPr>
     </w:lvl>
   </w:abstractNum>
-  <w:abstractNum w:abstractNumId="29" w15:restartNumberingAfterBreak="0">
+  <w:abstractNum w:abstractNumId="31" w15:restartNumberingAfterBreak="0">
     <w:nsid w:val="3E921BF7"/>
     <w:multiLevelType w:val="hybridMultilevel"/>
     <w:tmpl w:val="07D83C3E"/>
@@ -19229,7 +20905,7 @@
       </w:rPr>
     </w:lvl>
   </w:abstractNum>
-  <w:abstractNum w:abstractNumId="30" w15:restartNumberingAfterBreak="0">
+  <w:abstractNum w:abstractNumId="32" w15:restartNumberingAfterBreak="0">
     <w:nsid w:val="42767048"/>
     <w:multiLevelType w:val="hybridMultilevel"/>
     <w:tmpl w:val="1E98EFE6"/>
@@ -19315,7 +20991,7 @@
       </w:pPr>
     </w:lvl>
   </w:abstractNum>
-  <w:abstractNum w:abstractNumId="31" w15:restartNumberingAfterBreak="0">
+  <w:abstractNum w:abstractNumId="33" w15:restartNumberingAfterBreak="0">
     <w:nsid w:val="43067A6B"/>
     <w:multiLevelType w:val="hybridMultilevel"/>
     <w:tmpl w:val="6B8AF690"/>
@@ -19428,7 +21104,7 @@
       </w:rPr>
     </w:lvl>
   </w:abstractNum>
-  <w:abstractNum w:abstractNumId="32" w15:restartNumberingAfterBreak="0">
+  <w:abstractNum w:abstractNumId="34" w15:restartNumberingAfterBreak="0">
     <w:nsid w:val="438638CD"/>
     <w:multiLevelType w:val="hybridMultilevel"/>
     <w:tmpl w:val="8526AD56"/>
@@ -19541,7 +21217,7 @@
       </w:rPr>
     </w:lvl>
   </w:abstractNum>
-  <w:abstractNum w:abstractNumId="33" w15:restartNumberingAfterBreak="0">
+  <w:abstractNum w:abstractNumId="35" w15:restartNumberingAfterBreak="0">
     <w:nsid w:val="43FE2240"/>
     <w:multiLevelType w:val="hybridMultilevel"/>
     <w:tmpl w:val="379010B8"/>
@@ -19654,7 +21330,7 @@
       </w:rPr>
     </w:lvl>
   </w:abstractNum>
-  <w:abstractNum w:abstractNumId="34" w15:restartNumberingAfterBreak="0">
+  <w:abstractNum w:abstractNumId="36" w15:restartNumberingAfterBreak="0">
     <w:nsid w:val="440542AF"/>
     <w:multiLevelType w:val="hybridMultilevel"/>
     <w:tmpl w:val="3D3CB302"/>
@@ -19767,7 +21443,7 @@
       </w:rPr>
     </w:lvl>
   </w:abstractNum>
-  <w:abstractNum w:abstractNumId="35" w15:restartNumberingAfterBreak="0">
+  <w:abstractNum w:abstractNumId="37" w15:restartNumberingAfterBreak="0">
     <w:nsid w:val="465D19C4"/>
     <w:multiLevelType w:val="hybridMultilevel"/>
     <w:tmpl w:val="59DA5D9A"/>
@@ -19880,7 +21556,7 @@
       </w:rPr>
     </w:lvl>
   </w:abstractNum>
-  <w:abstractNum w:abstractNumId="36" w15:restartNumberingAfterBreak="0">
+  <w:abstractNum w:abstractNumId="38" w15:restartNumberingAfterBreak="0">
     <w:nsid w:val="49417DC1"/>
     <w:multiLevelType w:val="hybridMultilevel"/>
     <w:tmpl w:val="357411BA"/>
@@ -19993,7 +21669,120 @@
       </w:rPr>
     </w:lvl>
   </w:abstractNum>
-  <w:abstractNum w:abstractNumId="37" w15:restartNumberingAfterBreak="0">
+  <w:abstractNum w:abstractNumId="39" w15:restartNumberingAfterBreak="0">
+    <w:nsid w:val="4E2C2D1C"/>
+    <w:multiLevelType w:val="hybridMultilevel"/>
+    <w:tmpl w:val="9626D062"/>
+    <w:lvl w:ilvl="0" w:tplc="04090001">
+      <w:start w:val="1"/>
+      <w:numFmt w:val="bullet"/>
+      <w:lvlText w:val=""/>
+      <w:lvlJc w:val="left"/>
+      <w:pPr>
+        <w:ind w:left="720" w:hanging="360"/>
+      </w:pPr>
+      <w:rPr>
+        <w:rFonts w:ascii="Symbol" w:hAnsi="Symbol" w:hint="default"/>
+      </w:rPr>
+    </w:lvl>
+    <w:lvl w:ilvl="1" w:tplc="04090003" w:tentative="1">
+      <w:start w:val="1"/>
+      <w:numFmt w:val="bullet"/>
+      <w:lvlText w:val="o"/>
+      <w:lvlJc w:val="left"/>
+      <w:pPr>
+        <w:ind w:left="1440" w:hanging="360"/>
+      </w:pPr>
+      <w:rPr>
+        <w:rFonts w:ascii="Courier New" w:hAnsi="Courier New" w:cs="Courier New" w:hint="default"/>
+      </w:rPr>
+    </w:lvl>
+    <w:lvl w:ilvl="2" w:tplc="04090005" w:tentative="1">
+      <w:start w:val="1"/>
+      <w:numFmt w:val="bullet"/>
+      <w:lvlText w:val=""/>
+      <w:lvlJc w:val="left"/>
+      <w:pPr>
+        <w:ind w:left="2160" w:hanging="360"/>
+      </w:pPr>
+      <w:rPr>
+        <w:rFonts w:ascii="Wingdings" w:hAnsi="Wingdings" w:hint="default"/>
+      </w:rPr>
+    </w:lvl>
+    <w:lvl w:ilvl="3" w:tplc="04090001" w:tentative="1">
+      <w:start w:val="1"/>
+      <w:numFmt w:val="bullet"/>
+      <w:lvlText w:val=""/>
+      <w:lvlJc w:val="left"/>
+      <w:pPr>
+        <w:ind w:left="2880" w:hanging="360"/>
+      </w:pPr>
+      <w:rPr>
+        <w:rFonts w:ascii="Symbol" w:hAnsi="Symbol" w:hint="default"/>
+      </w:rPr>
+    </w:lvl>
+    <w:lvl w:ilvl="4" w:tplc="04090003" w:tentative="1">
+      <w:start w:val="1"/>
+      <w:numFmt w:val="bullet"/>
+      <w:lvlText w:val="o"/>
+      <w:lvlJc w:val="left"/>
+      <w:pPr>
+        <w:ind w:left="3600" w:hanging="360"/>
+      </w:pPr>
+      <w:rPr>
+        <w:rFonts w:ascii="Courier New" w:hAnsi="Courier New" w:cs="Courier New" w:hint="default"/>
+      </w:rPr>
+    </w:lvl>
+    <w:lvl w:ilvl="5" w:tplc="04090005" w:tentative="1">
+      <w:start w:val="1"/>
+      <w:numFmt w:val="bullet"/>
+      <w:lvlText w:val=""/>
+      <w:lvlJc w:val="left"/>
+      <w:pPr>
+        <w:ind w:left="4320" w:hanging="360"/>
+      </w:pPr>
+      <w:rPr>
+        <w:rFonts w:ascii="Wingdings" w:hAnsi="Wingdings" w:hint="default"/>
+      </w:rPr>
+    </w:lvl>
+    <w:lvl w:ilvl="6" w:tplc="04090001" w:tentative="1">
+      <w:start w:val="1"/>
+      <w:numFmt w:val="bullet"/>
+      <w:lvlText w:val=""/>
+      <w:lvlJc w:val="left"/>
+      <w:pPr>
+        <w:ind w:left="5040" w:hanging="360"/>
+      </w:pPr>
+      <w:rPr>
+        <w:rFonts w:ascii="Symbol" w:hAnsi="Symbol" w:hint="default"/>
+      </w:rPr>
+    </w:lvl>
+    <w:lvl w:ilvl="7" w:tplc="04090003" w:tentative="1">
+      <w:start w:val="1"/>
+      <w:numFmt w:val="bullet"/>
+      <w:lvlText w:val="o"/>
+      <w:lvlJc w:val="left"/>
+      <w:pPr>
+        <w:ind w:left="5760" w:hanging="360"/>
+      </w:pPr>
+      <w:rPr>
+        <w:rFonts w:ascii="Courier New" w:hAnsi="Courier New" w:cs="Courier New" w:hint="default"/>
+      </w:rPr>
+    </w:lvl>
+    <w:lvl w:ilvl="8" w:tplc="04090005" w:tentative="1">
+      <w:start w:val="1"/>
+      <w:numFmt w:val="bullet"/>
+      <w:lvlText w:val=""/>
+      <w:lvlJc w:val="left"/>
+      <w:pPr>
+        <w:ind w:left="6480" w:hanging="360"/>
+      </w:pPr>
+      <w:rPr>
+        <w:rFonts w:ascii="Wingdings" w:hAnsi="Wingdings" w:hint="default"/>
+      </w:rPr>
+    </w:lvl>
+  </w:abstractNum>
+  <w:abstractNum w:abstractNumId="40" w15:restartNumberingAfterBreak="0">
     <w:nsid w:val="4EB719F3"/>
     <w:multiLevelType w:val="hybridMultilevel"/>
     <w:tmpl w:val="9306D736"/>
@@ -20106,7 +21895,7 @@
       </w:rPr>
     </w:lvl>
   </w:abstractNum>
-  <w:abstractNum w:abstractNumId="38" w15:restartNumberingAfterBreak="0">
+  <w:abstractNum w:abstractNumId="41" w15:restartNumberingAfterBreak="0">
     <w:nsid w:val="4F1224C7"/>
     <w:multiLevelType w:val="hybridMultilevel"/>
     <w:tmpl w:val="026C68CA"/>
@@ -20219,7 +22008,7 @@
       </w:rPr>
     </w:lvl>
   </w:abstractNum>
-  <w:abstractNum w:abstractNumId="39" w15:restartNumberingAfterBreak="0">
+  <w:abstractNum w:abstractNumId="42" w15:restartNumberingAfterBreak="0">
     <w:nsid w:val="53E65E4A"/>
     <w:multiLevelType w:val="hybridMultilevel"/>
     <w:tmpl w:val="8C7E6872"/>
@@ -20332,7 +22121,7 @@
       </w:rPr>
     </w:lvl>
   </w:abstractNum>
-  <w:abstractNum w:abstractNumId="40" w15:restartNumberingAfterBreak="0">
+  <w:abstractNum w:abstractNumId="43" w15:restartNumberingAfterBreak="0">
     <w:nsid w:val="57A64A4A"/>
     <w:multiLevelType w:val="hybridMultilevel"/>
     <w:tmpl w:val="57F61210"/>
@@ -20445,7 +22234,7 @@
       </w:rPr>
     </w:lvl>
   </w:abstractNum>
-  <w:abstractNum w:abstractNumId="41" w15:restartNumberingAfterBreak="0">
+  <w:abstractNum w:abstractNumId="44" w15:restartNumberingAfterBreak="0">
     <w:nsid w:val="5BD1365B"/>
     <w:multiLevelType w:val="hybridMultilevel"/>
     <w:tmpl w:val="E5B0176A"/>
@@ -20558,7 +22347,7 @@
       </w:rPr>
     </w:lvl>
   </w:abstractNum>
-  <w:abstractNum w:abstractNumId="42" w15:restartNumberingAfterBreak="0">
+  <w:abstractNum w:abstractNumId="45" w15:restartNumberingAfterBreak="0">
     <w:nsid w:val="5EDB35EC"/>
     <w:multiLevelType w:val="hybridMultilevel"/>
     <w:tmpl w:val="74A42BD4"/>
@@ -20671,7 +22460,7 @@
       </w:rPr>
     </w:lvl>
   </w:abstractNum>
-  <w:abstractNum w:abstractNumId="43" w15:restartNumberingAfterBreak="0">
+  <w:abstractNum w:abstractNumId="46" w15:restartNumberingAfterBreak="0">
     <w:nsid w:val="60224FA5"/>
     <w:multiLevelType w:val="hybridMultilevel"/>
     <w:tmpl w:val="7CE4CD1A"/>
@@ -20784,7 +22573,7 @@
       </w:rPr>
     </w:lvl>
   </w:abstractNum>
-  <w:abstractNum w:abstractNumId="44" w15:restartNumberingAfterBreak="0">
+  <w:abstractNum w:abstractNumId="47" w15:restartNumberingAfterBreak="0">
     <w:nsid w:val="60D33E1C"/>
     <w:multiLevelType w:val="hybridMultilevel"/>
     <w:tmpl w:val="83B05A04"/>
@@ -20897,7 +22686,7 @@
       </w:rPr>
     </w:lvl>
   </w:abstractNum>
-  <w:abstractNum w:abstractNumId="45" w15:restartNumberingAfterBreak="0">
+  <w:abstractNum w:abstractNumId="48" w15:restartNumberingAfterBreak="0">
     <w:nsid w:val="63520FCD"/>
     <w:multiLevelType w:val="hybridMultilevel"/>
     <w:tmpl w:val="BC20B65E"/>
@@ -21010,7 +22799,7 @@
       </w:rPr>
     </w:lvl>
   </w:abstractNum>
-  <w:abstractNum w:abstractNumId="46" w15:restartNumberingAfterBreak="0">
+  <w:abstractNum w:abstractNumId="49" w15:restartNumberingAfterBreak="0">
     <w:nsid w:val="67712598"/>
     <w:multiLevelType w:val="hybridMultilevel"/>
     <w:tmpl w:val="CF662074"/>
@@ -21123,7 +22912,7 @@
       </w:rPr>
     </w:lvl>
   </w:abstractNum>
-  <w:abstractNum w:abstractNumId="47" w15:restartNumberingAfterBreak="0">
+  <w:abstractNum w:abstractNumId="50" w15:restartNumberingAfterBreak="0">
     <w:nsid w:val="685F5CFD"/>
     <w:multiLevelType w:val="hybridMultilevel"/>
     <w:tmpl w:val="3C88BD80"/>
@@ -21236,7 +23025,7 @@
       </w:rPr>
     </w:lvl>
   </w:abstractNum>
-  <w:abstractNum w:abstractNumId="48" w15:restartNumberingAfterBreak="0">
+  <w:abstractNum w:abstractNumId="51" w15:restartNumberingAfterBreak="0">
     <w:nsid w:val="68E30751"/>
     <w:multiLevelType w:val="hybridMultilevel"/>
     <w:tmpl w:val="C180F3BC"/>
@@ -21349,7 +23138,7 @@
       </w:rPr>
     </w:lvl>
   </w:abstractNum>
-  <w:abstractNum w:abstractNumId="49" w15:restartNumberingAfterBreak="0">
+  <w:abstractNum w:abstractNumId="52" w15:restartNumberingAfterBreak="0">
     <w:nsid w:val="690A7EF9"/>
     <w:multiLevelType w:val="hybridMultilevel"/>
     <w:tmpl w:val="DD549D3C"/>
@@ -21462,7 +23251,7 @@
       </w:rPr>
     </w:lvl>
   </w:abstractNum>
-  <w:abstractNum w:abstractNumId="50" w15:restartNumberingAfterBreak="0">
+  <w:abstractNum w:abstractNumId="53" w15:restartNumberingAfterBreak="0">
     <w:nsid w:val="69E07337"/>
     <w:multiLevelType w:val="hybridMultilevel"/>
     <w:tmpl w:val="8BD25784"/>
@@ -21575,7 +23364,7 @@
       </w:rPr>
     </w:lvl>
   </w:abstractNum>
-  <w:abstractNum w:abstractNumId="51" w15:restartNumberingAfterBreak="0">
+  <w:abstractNum w:abstractNumId="54" w15:restartNumberingAfterBreak="0">
     <w:nsid w:val="6A921E1A"/>
     <w:multiLevelType w:val="hybridMultilevel"/>
     <w:tmpl w:val="EC482F82"/>
@@ -21688,7 +23477,7 @@
       </w:rPr>
     </w:lvl>
   </w:abstractNum>
-  <w:abstractNum w:abstractNumId="52" w15:restartNumberingAfterBreak="0">
+  <w:abstractNum w:abstractNumId="55" w15:restartNumberingAfterBreak="0">
     <w:nsid w:val="6A992E25"/>
     <w:multiLevelType w:val="hybridMultilevel"/>
     <w:tmpl w:val="7CB82F38"/>
@@ -21801,7 +23590,7 @@
       </w:rPr>
     </w:lvl>
   </w:abstractNum>
-  <w:abstractNum w:abstractNumId="53" w15:restartNumberingAfterBreak="0">
+  <w:abstractNum w:abstractNumId="56" w15:restartNumberingAfterBreak="0">
     <w:nsid w:val="6C0B2D42"/>
     <w:multiLevelType w:val="hybridMultilevel"/>
     <w:tmpl w:val="D8408682"/>
@@ -21914,7 +23703,7 @@
       </w:rPr>
     </w:lvl>
   </w:abstractNum>
-  <w:abstractNum w:abstractNumId="54" w15:restartNumberingAfterBreak="0">
+  <w:abstractNum w:abstractNumId="57" w15:restartNumberingAfterBreak="0">
     <w:nsid w:val="6EE87CD0"/>
     <w:multiLevelType w:val="hybridMultilevel"/>
     <w:tmpl w:val="1326F5B2"/>
@@ -22027,7 +23816,7 @@
       </w:rPr>
     </w:lvl>
   </w:abstractNum>
-  <w:abstractNum w:abstractNumId="55" w15:restartNumberingAfterBreak="0">
+  <w:abstractNum w:abstractNumId="58" w15:restartNumberingAfterBreak="0">
     <w:nsid w:val="747D26C2"/>
     <w:multiLevelType w:val="hybridMultilevel"/>
     <w:tmpl w:val="585EA518"/>
@@ -22140,7 +23929,7 @@
       </w:rPr>
     </w:lvl>
   </w:abstractNum>
-  <w:abstractNum w:abstractNumId="56" w15:restartNumberingAfterBreak="0">
+  <w:abstractNum w:abstractNumId="59" w15:restartNumberingAfterBreak="0">
     <w:nsid w:val="74BC1C1B"/>
     <w:multiLevelType w:val="hybridMultilevel"/>
     <w:tmpl w:val="DF3A32BC"/>
@@ -22253,7 +24042,7 @@
       </w:rPr>
     </w:lvl>
   </w:abstractNum>
-  <w:abstractNum w:abstractNumId="57" w15:restartNumberingAfterBreak="0">
+  <w:abstractNum w:abstractNumId="60" w15:restartNumberingAfterBreak="0">
     <w:nsid w:val="78E404C7"/>
     <w:multiLevelType w:val="hybridMultilevel"/>
     <w:tmpl w:val="FB0ED528"/>
@@ -22339,7 +24128,7 @@
       </w:pPr>
     </w:lvl>
   </w:abstractNum>
-  <w:abstractNum w:abstractNumId="58" w15:restartNumberingAfterBreak="0">
+  <w:abstractNum w:abstractNumId="61" w15:restartNumberingAfterBreak="0">
     <w:nsid w:val="7A880265"/>
     <w:multiLevelType w:val="hybridMultilevel"/>
     <w:tmpl w:val="00CE3C72"/>
@@ -22453,181 +24242,190 @@
     </w:lvl>
   </w:abstractNum>
   <w:num w:numId="1" w16cid:durableId="451706812">
-    <w:abstractNumId w:val="10"/>
+    <w:abstractNumId w:val="11"/>
   </w:num>
   <w:num w:numId="2" w16cid:durableId="943072337">
-    <w:abstractNumId w:val="42"/>
+    <w:abstractNumId w:val="45"/>
   </w:num>
   <w:num w:numId="3" w16cid:durableId="667709974">
-    <w:abstractNumId w:val="57"/>
+    <w:abstractNumId w:val="60"/>
   </w:num>
   <w:num w:numId="4" w16cid:durableId="42875176">
     <w:abstractNumId w:val="2"/>
   </w:num>
   <w:num w:numId="5" w16cid:durableId="1469126308">
-    <w:abstractNumId w:val="28"/>
+    <w:abstractNumId w:val="30"/>
   </w:num>
   <w:num w:numId="6" w16cid:durableId="2092892987">
-    <w:abstractNumId w:val="34"/>
+    <w:abstractNumId w:val="36"/>
   </w:num>
   <w:num w:numId="7" w16cid:durableId="722296573">
-    <w:abstractNumId w:val="49"/>
+    <w:abstractNumId w:val="52"/>
   </w:num>
   <w:num w:numId="8" w16cid:durableId="938299569">
-    <w:abstractNumId w:val="30"/>
+    <w:abstractNumId w:val="32"/>
   </w:num>
   <w:num w:numId="9" w16cid:durableId="1003119981">
     <w:abstractNumId w:val="1"/>
   </w:num>
   <w:num w:numId="10" w16cid:durableId="742533557">
+    <w:abstractNumId w:val="13"/>
+  </w:num>
+  <w:num w:numId="11" w16cid:durableId="1140876254">
     <w:abstractNumId w:val="12"/>
   </w:num>
-  <w:num w:numId="11" w16cid:durableId="1140876254">
-    <w:abstractNumId w:val="11"/>
-  </w:num>
   <w:num w:numId="12" w16cid:durableId="311175087">
-    <w:abstractNumId w:val="24"/>
+    <w:abstractNumId w:val="25"/>
   </w:num>
   <w:num w:numId="13" w16cid:durableId="1643578613">
-    <w:abstractNumId w:val="48"/>
+    <w:abstractNumId w:val="51"/>
   </w:num>
   <w:num w:numId="14" w16cid:durableId="28188523">
-    <w:abstractNumId w:val="14"/>
+    <w:abstractNumId w:val="15"/>
   </w:num>
   <w:num w:numId="15" w16cid:durableId="273635984">
     <w:abstractNumId w:val="0"/>
   </w:num>
   <w:num w:numId="16" w16cid:durableId="632515647">
-    <w:abstractNumId w:val="54"/>
+    <w:abstractNumId w:val="57"/>
   </w:num>
   <w:num w:numId="17" w16cid:durableId="1717313687">
     <w:abstractNumId w:val="3"/>
   </w:num>
   <w:num w:numId="18" w16cid:durableId="350423995">
-    <w:abstractNumId w:val="39"/>
+    <w:abstractNumId w:val="42"/>
   </w:num>
   <w:num w:numId="19" w16cid:durableId="1476485022">
-    <w:abstractNumId w:val="56"/>
+    <w:abstractNumId w:val="59"/>
   </w:num>
   <w:num w:numId="20" w16cid:durableId="798887380">
-    <w:abstractNumId w:val="21"/>
+    <w:abstractNumId w:val="22"/>
   </w:num>
   <w:num w:numId="21" w16cid:durableId="865338109">
-    <w:abstractNumId w:val="31"/>
+    <w:abstractNumId w:val="33"/>
   </w:num>
   <w:num w:numId="22" w16cid:durableId="1891963560">
-    <w:abstractNumId w:val="51"/>
+    <w:abstractNumId w:val="54"/>
   </w:num>
   <w:num w:numId="23" w16cid:durableId="337780777">
-    <w:abstractNumId w:val="50"/>
+    <w:abstractNumId w:val="53"/>
   </w:num>
   <w:num w:numId="24" w16cid:durableId="1319992471">
     <w:abstractNumId w:val="5"/>
   </w:num>
   <w:num w:numId="25" w16cid:durableId="127862042">
-    <w:abstractNumId w:val="41"/>
+    <w:abstractNumId w:val="44"/>
   </w:num>
   <w:num w:numId="26" w16cid:durableId="1227882914">
-    <w:abstractNumId w:val="23"/>
+    <w:abstractNumId w:val="24"/>
   </w:num>
   <w:num w:numId="27" w16cid:durableId="780151792">
-    <w:abstractNumId w:val="32"/>
+    <w:abstractNumId w:val="34"/>
   </w:num>
   <w:num w:numId="28" w16cid:durableId="1863471563">
-    <w:abstractNumId w:val="8"/>
+    <w:abstractNumId w:val="9"/>
   </w:num>
   <w:num w:numId="29" w16cid:durableId="371878930">
+    <w:abstractNumId w:val="40"/>
+  </w:num>
+  <w:num w:numId="30" w16cid:durableId="388262574">
+    <w:abstractNumId w:val="55"/>
+  </w:num>
+  <w:num w:numId="31" w16cid:durableId="1178665434">
+    <w:abstractNumId w:val="38"/>
+  </w:num>
+  <w:num w:numId="32" w16cid:durableId="915287788">
     <w:abstractNumId w:val="37"/>
   </w:num>
-  <w:num w:numId="30" w16cid:durableId="388262574">
-    <w:abstractNumId w:val="52"/>
-  </w:num>
-  <w:num w:numId="31" w16cid:durableId="1178665434">
-    <w:abstractNumId w:val="36"/>
-  </w:num>
-  <w:num w:numId="32" w16cid:durableId="915287788">
+  <w:num w:numId="33" w16cid:durableId="1896235540">
     <w:abstractNumId w:val="35"/>
-  </w:num>
-  <w:num w:numId="33" w16cid:durableId="1896235540">
-    <w:abstractNumId w:val="33"/>
   </w:num>
   <w:num w:numId="34" w16cid:durableId="1107042679">
     <w:abstractNumId w:val="6"/>
   </w:num>
   <w:num w:numId="35" w16cid:durableId="874779833">
-    <w:abstractNumId w:val="26"/>
+    <w:abstractNumId w:val="28"/>
   </w:num>
   <w:num w:numId="36" w16cid:durableId="948898611">
-    <w:abstractNumId w:val="38"/>
+    <w:abstractNumId w:val="41"/>
   </w:num>
   <w:num w:numId="37" w16cid:durableId="590242007">
-    <w:abstractNumId w:val="53"/>
+    <w:abstractNumId w:val="56"/>
   </w:num>
   <w:num w:numId="38" w16cid:durableId="857157669">
-    <w:abstractNumId w:val="22"/>
+    <w:abstractNumId w:val="23"/>
   </w:num>
   <w:num w:numId="39" w16cid:durableId="906645066">
-    <w:abstractNumId w:val="29"/>
+    <w:abstractNumId w:val="31"/>
   </w:num>
   <w:num w:numId="40" w16cid:durableId="780346730">
-    <w:abstractNumId w:val="16"/>
+    <w:abstractNumId w:val="17"/>
   </w:num>
   <w:num w:numId="41" w16cid:durableId="1991328286">
-    <w:abstractNumId w:val="44"/>
+    <w:abstractNumId w:val="47"/>
   </w:num>
   <w:num w:numId="42" w16cid:durableId="1379402897">
     <w:abstractNumId w:val="7"/>
   </w:num>
   <w:num w:numId="43" w16cid:durableId="1461269641">
-    <w:abstractNumId w:val="17"/>
+    <w:abstractNumId w:val="18"/>
   </w:num>
   <w:num w:numId="44" w16cid:durableId="2044283027">
-    <w:abstractNumId w:val="58"/>
+    <w:abstractNumId w:val="61"/>
   </w:num>
   <w:num w:numId="45" w16cid:durableId="1396320795">
-    <w:abstractNumId w:val="13"/>
+    <w:abstractNumId w:val="14"/>
   </w:num>
   <w:num w:numId="46" w16cid:durableId="1484538646">
-    <w:abstractNumId w:val="40"/>
+    <w:abstractNumId w:val="43"/>
   </w:num>
   <w:num w:numId="47" w16cid:durableId="1667320133">
-    <w:abstractNumId w:val="25"/>
+    <w:abstractNumId w:val="26"/>
   </w:num>
   <w:num w:numId="48" w16cid:durableId="894658374">
+    <w:abstractNumId w:val="20"/>
+  </w:num>
+  <w:num w:numId="49" w16cid:durableId="41682562">
+    <w:abstractNumId w:val="46"/>
+  </w:num>
+  <w:num w:numId="50" w16cid:durableId="681009789">
+    <w:abstractNumId w:val="10"/>
+  </w:num>
+  <w:num w:numId="51" w16cid:durableId="1973946117">
+    <w:abstractNumId w:val="21"/>
+  </w:num>
+  <w:num w:numId="52" w16cid:durableId="267203936">
+    <w:abstractNumId w:val="49"/>
+  </w:num>
+  <w:num w:numId="53" w16cid:durableId="1364747124">
     <w:abstractNumId w:val="19"/>
   </w:num>
-  <w:num w:numId="49" w16cid:durableId="41682562">
-    <w:abstractNumId w:val="43"/>
-  </w:num>
-  <w:num w:numId="50" w16cid:durableId="681009789">
-    <w:abstractNumId w:val="9"/>
-  </w:num>
-  <w:num w:numId="51" w16cid:durableId="1973946117">
-    <w:abstractNumId w:val="20"/>
-  </w:num>
-  <w:num w:numId="52" w16cid:durableId="267203936">
-    <w:abstractNumId w:val="46"/>
-  </w:num>
-  <w:num w:numId="53" w16cid:durableId="1364747124">
-    <w:abstractNumId w:val="18"/>
-  </w:num>
   <w:num w:numId="54" w16cid:durableId="465391243">
-    <w:abstractNumId w:val="45"/>
+    <w:abstractNumId w:val="48"/>
   </w:num>
   <w:num w:numId="55" w16cid:durableId="1051079903">
-    <w:abstractNumId w:val="15"/>
+    <w:abstractNumId w:val="16"/>
   </w:num>
   <w:num w:numId="56" w16cid:durableId="1185172641">
-    <w:abstractNumId w:val="55"/>
+    <w:abstractNumId w:val="58"/>
   </w:num>
   <w:num w:numId="57" w16cid:durableId="762216263">
     <w:abstractNumId w:val="4"/>
   </w:num>
   <w:num w:numId="58" w16cid:durableId="523446550">
-    <w:abstractNumId w:val="47"/>
+    <w:abstractNumId w:val="50"/>
   </w:num>
   <w:num w:numId="59" w16cid:durableId="1654337723">
+    <w:abstractNumId w:val="29"/>
+  </w:num>
+  <w:num w:numId="60" w16cid:durableId="362248408">
+    <w:abstractNumId w:val="39"/>
+  </w:num>
+  <w:num w:numId="61" w16cid:durableId="1846439190">
     <w:abstractNumId w:val="27"/>
+  </w:num>
+  <w:num w:numId="62" w16cid:durableId="391924560">
+    <w:abstractNumId w:val="8"/>
   </w:num>
 </w:numbering>
 </file>

</xml_diff>